<commit_message>
Ameliore la mise en page des fiches et corrige les caracteres
Co-authored-by: Eva <urdirditfurd@users.noreply.github.com>
</commit_message>
<xml_diff>
--- a/droit social dcg/1- sources du droit social.docx
+++ b/droit social dcg/1- sources du droit social.docx
@@ -8,6 +8,11 @@
         <w:jc w:val="center"/>
       </w:pPr>
       <w:r>
+        <w:rPr>
+          <w:b/>
+          <w:color w:val="1F4E79"/>
+          <w:sz w:val="34"/>
+        </w:rPr>
         <w:t>FICHE 1 : LES SOURCES DU DROIT SOCIAL</w:t>
       </w:r>
     </w:p>
@@ -17,7 +22,12 @@
         <w:pStyle w:val="Heading2"/>
       </w:pPr>
       <w:r>
-        <w:t>LES SOURCES INTERNATIONALES ET COMMUNAUTAIRES I �</w:t>
+        <w:rPr>
+          <w:b/>
+          <w:color w:val="2F5496"/>
+          <w:sz w:val="24"/>
+        </w:rPr>
+        <w:t>LES SOURCES INTERNATIONALES ET COMMUNAUTAIRES I e</w:t>
       </w:r>
     </w:p>
     <w:p>
@@ -25,7 +35,12 @@
         <w:pStyle w:val="Heading2"/>
       </w:pPr>
       <w:r>
-        <w:t>LES ACCORDS INTERNATIONAUX A �</w:t>
+        <w:rPr>
+          <w:b/>
+          <w:color w:val="2F5496"/>
+          <w:sz w:val="24"/>
+        </w:rPr>
+        <w:t>LES ACCORDS INTERNATIONAUX A e</w:t>
       </w:r>
     </w:p>
     <w:p>
@@ -33,52 +48,102 @@
         <w:pStyle w:val="Heading2"/>
       </w:pPr>
       <w:r>
-        <w:t>L�ORGANISATION INTERNATIONALE DU TRAVAIL</w:t>
+        <w:rPr>
+          <w:b/>
+          <w:color w:val="2F5496"/>
+          <w:sz w:val="24"/>
+        </w:rPr>
+        <w:t>L'ORGANISATION INTERNATIONALE DU TRAVAIL</w:t>
       </w:r>
     </w:p>
     <w:p>
       <w:r>
+        <w:rPr>
+          <w:b w:val="0"/>
+          <w:color w:val="000000"/>
+          <w:sz w:val="22"/>
+        </w:rPr>
         <w:t>?</w:t>
       </w:r>
     </w:p>
     <w:p>
       <w:r>
-        <w:t>Les accords internationaux, sous la forme de trait�s, sont une source importante du droit social, non pas tant du fait de</w:t>
+        <w:rPr>
+          <w:b w:val="0"/>
+          <w:color w:val="000000"/>
+          <w:sz w:val="22"/>
+        </w:rPr>
+        <w:t>Les accords internationaux, sous la forme de traites, sont une source importante du droit social, non pas tant du fait de</w:t>
       </w:r>
     </w:p>
     <w:p>
       <w:r>
-        <w:t>leur abondance mais � cause de leurs effets dans le droit interne</w:t>
+        <w:rPr>
+          <w:b w:val="0"/>
+          <w:color w:val="000000"/>
+          <w:sz w:val="22"/>
+        </w:rPr>
+        <w:t>leur abondance mais e cause de leurs effets dans le droit interne</w:t>
       </w:r>
     </w:p>
     <w:p>
       <w:r>
-        <w:t>Au niveau international, c�est l�Organisation Internationale du Travail (OIT), qui joue un r�le de premier plan. Elle a</w:t>
+        <w:rPr>
+          <w:b w:val="0"/>
+          <w:color w:val="000000"/>
+          <w:sz w:val="22"/>
+        </w:rPr>
+        <w:t>Au niveau international, c'est l'Organisation Internationale du Travail (OIT), qui joue un rele de premier plan. Elle a</w:t>
       </w:r>
     </w:p>
     <w:p>
       <w:r>
-        <w:t>vocation � �dicter des normes de nature � am�liorer les conditions de travail dans le monde et par l� m�me d�unifier, pas</w:t>
+        <w:rPr>
+          <w:b w:val="0"/>
+          <w:color w:val="000000"/>
+          <w:sz w:val="22"/>
+        </w:rPr>
+        <w:t>vocation e edicter des normes de nature e ameliorer les conditions de travail dans le monde et par l' m'me d'unifier, pas</w:t>
       </w:r>
     </w:p>
     <w:p>
       <w:r>
-        <w:t>� pas, les droits sociaux des pays membres. Elle produit aussi un travail documentaire de premier ordre en mati�re de</w:t>
+        <w:rPr>
+          <w:b w:val="0"/>
+          <w:color w:val="000000"/>
+          <w:sz w:val="22"/>
+        </w:rPr>
+        <w:t>e pas, les droits sociaux des pays membres. Elle produit aussi un travail documentaire de premier ordre en matiere de</w:t>
       </w:r>
     </w:p>
     <w:p>
       <w:r>
-        <w:t>r�glementation du travail et de protection sociale dans le monde (cf. Rapport 2020 de la Commission d�experts pour</w:t>
+        <w:rPr>
+          <w:b w:val="0"/>
+          <w:color w:val="000000"/>
+          <w:sz w:val="22"/>
+        </w:rPr>
+        <w:t>reglementation du travail et de protection sociale dans le monde (cf. Rapport 2020 de la Commission d'experts pour</w:t>
       </w:r>
     </w:p>
     <w:p>
       <w:r>
-        <w:t>l�application des conventions et recommandations).</w:t>
+        <w:rPr>
+          <w:b w:val="0"/>
+          <w:color w:val="000000"/>
+          <w:sz w:val="22"/>
+        </w:rPr>
+        <w:t>l'application des conventions et recommandations).</w:t>
       </w:r>
     </w:p>
     <w:p>
       <w:r>
-        <w:t>Organe des Nations Unies, l�OIT a une structure tripartite. Elle comprend :</w:t>
+        <w:rPr>
+          <w:b w:val="0"/>
+          <w:color w:val="000000"/>
+          <w:sz w:val="22"/>
+        </w:rPr>
+        <w:t>Organe des Nations Unies, l'OIT a une structure tripartite. Elle comprend :</w:t>
       </w:r>
     </w:p>
     <w:p>
@@ -86,7 +151,12 @@
         <w:pStyle w:val="ListBullet"/>
       </w:pPr>
       <w:r>
-        <w:t>La Conf�rence internationale du travail. C�est le parlement de l�organisation. -</w:t>
+        <w:rPr>
+          <w:b w:val="0"/>
+          <w:color w:val="000000"/>
+          <w:sz w:val="22"/>
+        </w:rPr>
+        <w:t>La Conference internationale du travail. C'est le parlement de l'organisation.</w:t>
       </w:r>
     </w:p>
     <w:p>
@@ -94,7 +164,12 @@
         <w:pStyle w:val="ListBullet"/>
       </w:pPr>
       <w:r>
-        <w:t>Le Conseil d�administration qui constitue l�organe ex�cutif. -</w:t>
+        <w:rPr>
+          <w:b w:val="0"/>
+          <w:color w:val="000000"/>
+          <w:sz w:val="22"/>
+        </w:rPr>
+        <w:t>Le Conseil d'administration qui constitue l'organe executif.</w:t>
       </w:r>
     </w:p>
     <w:p>
@@ -102,17 +177,32 @@
         <w:pStyle w:val="ListBullet"/>
       </w:pPr>
       <w:r>
-        <w:t>Le Bureau international du travail (BIT). Il constitue le secr�tariat permanent de l�OIT et pr�pare les projets -</w:t>
+        <w:rPr>
+          <w:b w:val="0"/>
+          <w:color w:val="000000"/>
+          <w:sz w:val="22"/>
+        </w:rPr>
+        <w:t>Le Bureau international du travail (BIT). Il constitue le secretariat permanent de l'OIT et prepare les projets</w:t>
       </w:r>
     </w:p>
     <w:p>
       <w:r>
-        <w:t>d�actions.</w:t>
+        <w:rPr>
+          <w:b w:val="0"/>
+          <w:color w:val="000000"/>
+          <w:sz w:val="22"/>
+        </w:rPr>
+        <w:t>d'actions.</w:t>
       </w:r>
     </w:p>
     <w:p>
       <w:r>
-        <w:t>Elle intervient en utilisant diff�rents instruments juridiques :</w:t>
+        <w:rPr>
+          <w:b w:val="0"/>
+          <w:color w:val="000000"/>
+          <w:sz w:val="22"/>
+        </w:rPr>
+        <w:t>Elle intervient en utilisant differents instruments juridiques :</w:t>
       </w:r>
     </w:p>
     <w:p>
@@ -120,17 +210,32 @@
         <w:pStyle w:val="ListBullet"/>
       </w:pPr>
       <w:r>
-        <w:t>Les conventions, qui, une fois ratifi�es par les �tats, cr�ent � leur charge des obligations. Par exemple, la convention -</w:t>
+        <w:rPr>
+          <w:b w:val="0"/>
+          <w:color w:val="000000"/>
+          <w:sz w:val="22"/>
+        </w:rPr>
+        <w:t>Les conventions, qui, une fois ratifiees par les etats, creent e leur charge des obligations. Par exemple, la convention</w:t>
       </w:r>
     </w:p>
     <w:p>
       <w:r>
-        <w:t>concernant l��limination de la violence et du harc�lement dans le monde du travail, adopt�e par la conf�rence � sa</w:t>
+        <w:rPr>
+          <w:b w:val="0"/>
+          <w:color w:val="000000"/>
+          <w:sz w:val="22"/>
+        </w:rPr>
+        <w:t>concernant l'elimination de la violence et du harcelement dans le monde du travail, adoptee par la conference e sa</w:t>
       </w:r>
     </w:p>
     <w:p>
       <w:r>
-        <w:t>cent huiti�me session ( Gen�ve, 21 juin 2019).</w:t>
+        <w:rPr>
+          <w:b w:val="0"/>
+          <w:color w:val="000000"/>
+          <w:sz w:val="22"/>
+        </w:rPr>
+        <w:t>cent huitieme session ( Geneve, 21 juin 2019).</w:t>
       </w:r>
     </w:p>
     <w:p>
@@ -138,12 +243,22 @@
         <w:pStyle w:val="ListBullet"/>
       </w:pPr>
       <w:r>
-        <w:t>Les recommandations, qui constituent un droit mou, dans la mesure o� elles se contentent de d�finir des objectifs -</w:t>
+        <w:rPr>
+          <w:b w:val="0"/>
+          <w:color w:val="000000"/>
+          <w:sz w:val="22"/>
+        </w:rPr>
+        <w:t>Les recommandations, qui constituent un droit mou, dans la mesure oe elles se contentent de d'finir des objectifs</w:t>
       </w:r>
     </w:p>
     <w:p>
       <w:r>
-        <w:t>(ex. : Recommandation (n� 205) sur l�emploi et le travail d�cent pour la paix et la r�silience, 2017).</w:t>
+        <w:rPr>
+          <w:b w:val="0"/>
+          <w:color w:val="000000"/>
+          <w:sz w:val="22"/>
+        </w:rPr>
+        <w:t>(ex. : Recommandation (n' 205) sur l'emploi et le travail d'cent pour la paix et la resilience, 2017).</w:t>
       </w:r>
     </w:p>
     <w:p>
@@ -151,27 +266,52 @@
         <w:pStyle w:val="Heading2"/>
       </w:pPr>
       <w:r>
-        <w:t>LE DROIT EUROP�EN NON COMMUNAUTAIRE</w:t>
+        <w:rPr>
+          <w:b/>
+          <w:color w:val="2F5496"/>
+          <w:sz w:val="24"/>
+        </w:rPr>
+        <w:t>LE DROIT EUROPeEN NON COMMUNAUTAIRE</w:t>
       </w:r>
     </w:p>
     <w:p>
       <w:r>
+        <w:rPr>
+          <w:b w:val="0"/>
+          <w:color w:val="000000"/>
+          <w:sz w:val="22"/>
+        </w:rPr>
         <w:t>?</w:t>
       </w:r>
     </w:p>
     <w:p>
       <w:r>
-        <w:t>Il s�agit des conventions et autres textes pris dans le cadre du Conseil de l�Europe. Le Conseil de l�Europe est une</w:t>
+        <w:rPr>
+          <w:b w:val="0"/>
+          <w:color w:val="000000"/>
+          <w:sz w:val="22"/>
+        </w:rPr>
+        <w:t>Il s'agit des conventions et autres textes pris dans le cadre du Conseil de l'Europe. Le Conseil de l'Europe est une</w:t>
       </w:r>
     </w:p>
     <w:p>
       <w:r>
-        <w:t>organisation � dimension paneurop�enne qui regroupe 47 �tats membres dont l�objectif est de promouvoir en Europe</w:t>
+        <w:rPr>
+          <w:b w:val="0"/>
+          <w:color w:val="000000"/>
+          <w:sz w:val="22"/>
+        </w:rPr>
+        <w:t>organisation e dimension paneuropeenne qui regroupe 47 etats membres dont l'objectif est de promouvoir en Europe</w:t>
       </w:r>
     </w:p>
     <w:p>
       <w:r>
-        <w:t>les valeurs d�mocratiques. En mati�re de droit social deux textes sont particuli�rement importants :</w:t>
+        <w:rPr>
+          <w:b w:val="0"/>
+          <w:color w:val="000000"/>
+          <w:sz w:val="22"/>
+        </w:rPr>
+        <w:t>les valeurs d'mocratiques. En matiere de droit social deux textes sont particulierement importants :</w:t>
       </w:r>
     </w:p>
     <w:p>
@@ -179,7 +319,12 @@
         <w:pStyle w:val="ListBullet"/>
       </w:pPr>
       <w:r>
-        <w:t>La convention de sauvegarde des droits de l�homme entr�e en vigueur en 1953. -</w:t>
+        <w:rPr>
+          <w:b w:val="0"/>
+          <w:color w:val="000000"/>
+          <w:sz w:val="22"/>
+        </w:rPr>
+        <w:t>La convention de sauvegarde des droits de l'homme entree en vigueur en 1953.</w:t>
       </w:r>
     </w:p>
     <w:p>
@@ -187,7 +332,12 @@
         <w:pStyle w:val="ListBullet"/>
       </w:pPr>
       <w:r>
-        <w:t>La charte sociale europ�enne sign�e en 1961 et r�vis�e en 1996. -</w:t>
+        <w:rPr>
+          <w:b w:val="0"/>
+          <w:color w:val="000000"/>
+          <w:sz w:val="22"/>
+        </w:rPr>
+        <w:t>La charte sociale europeenne signee en 1961 et revisee en 1996.</w:t>
       </w:r>
     </w:p>
     <w:p>
@@ -195,7 +345,12 @@
         <w:pStyle w:val="Heading2"/>
       </w:pPr>
       <w:r>
-        <w:t>LE DROIT DE L�UNION EUROP�ENNE B �</w:t>
+        <w:rPr>
+          <w:b/>
+          <w:color w:val="2F5496"/>
+          <w:sz w:val="24"/>
+        </w:rPr>
+        <w:t>LE DROIT DE L'UNION EUROPeENNE B e</w:t>
       </w:r>
     </w:p>
     <w:p>
@@ -203,42 +358,82 @@
         <w:pStyle w:val="Heading2"/>
       </w:pPr>
       <w:r>
+        <w:rPr>
+          <w:b/>
+          <w:color w:val="2F5496"/>
+          <w:sz w:val="24"/>
+        </w:rPr>
         <w:t>LE DROIT PRIMAIRE</w:t>
       </w:r>
     </w:p>
     <w:p>
       <w:r>
+        <w:rPr>
+          <w:b w:val="0"/>
+          <w:color w:val="000000"/>
+          <w:sz w:val="22"/>
+        </w:rPr>
         <w:t>?</w:t>
       </w:r>
     </w:p>
     <w:p>
       <w:r>
-        <w:t>Il se compose des diff�rents trait�s. Au titre du droit social quelques textes m�ritent d��tre �voqu�s : La Charte</w:t>
+        <w:rPr>
+          <w:b w:val="0"/>
+          <w:color w:val="000000"/>
+          <w:sz w:val="22"/>
+        </w:rPr>
+        <w:t>Il se compose des differents traites. Au titre du droit social quelques textes m'ritent d'etre evoques : La Charte</w:t>
       </w:r>
     </w:p>
     <w:p>
       <w:r>
-        <w:t>communautaire des droits sociaux fondamentaux des travailleurs de 1989, Le trait� de Maastricht de 1992 qui comprend</w:t>
+        <w:rPr>
+          <w:b w:val="0"/>
+          <w:color w:val="000000"/>
+          <w:sz w:val="22"/>
+        </w:rPr>
+        <w:t>communautaire des droits sociaux fondamentaux des travailleurs de 1989, Le traite de Maastricht de 1992 qui comprend</w:t>
       </w:r>
     </w:p>
     <w:p>
       <w:r>
-        <w:t>un protocole social, le trait� d�Amsterdam de 1997 et plus r�cemment le trait� de Nice, entr� en vigueur au 1</w:t>
+        <w:rPr>
+          <w:b w:val="0"/>
+          <w:color w:val="000000"/>
+          <w:sz w:val="22"/>
+        </w:rPr>
+        <w:t>un protocole social, le traite d'Amsterdam de 1997 et plus recemment le traite de Nice, entre en vigueur au 1</w:t>
       </w:r>
     </w:p>
     <w:p>
       <w:r>
+        <w:rPr>
+          <w:b w:val="0"/>
+          <w:color w:val="000000"/>
+          <w:sz w:val="22"/>
+        </w:rPr>
         <w:t>er</w:t>
       </w:r>
     </w:p>
     <w:p>
       <w:r>
-        <w:t>f�vrier 2003</w:t>
+        <w:rPr>
+          <w:b w:val="0"/>
+          <w:color w:val="000000"/>
+          <w:sz w:val="22"/>
+        </w:rPr>
+        <w:t>fevrier 2003</w:t>
       </w:r>
     </w:p>
     <w:p>
       <w:r>
-        <w:t>dont les dispositions sociales sont �nonc�es aux articles 136 et suivants.</w:t>
+        <w:rPr>
+          <w:b w:val="0"/>
+          <w:color w:val="000000"/>
+          <w:sz w:val="22"/>
+        </w:rPr>
+        <w:t>dont les dispositions sociales sont enoncees aux articles 136 et suivants.</w:t>
       </w:r>
     </w:p>
     <w:p>
@@ -246,16 +441,31 @@
         <w:pStyle w:val="Heading2"/>
       </w:pPr>
       <w:r>
-        <w:t>LE DROIT D�RIV�</w:t>
+        <w:rPr>
+          <w:b/>
+          <w:color w:val="2F5496"/>
+          <w:sz w:val="24"/>
+        </w:rPr>
+        <w:t>LE DROIT D'RIVe</w:t>
       </w:r>
     </w:p>
     <w:p>
       <w:r>
+        <w:rPr>
+          <w:b w:val="0"/>
+          <w:color w:val="000000"/>
+          <w:sz w:val="22"/>
+        </w:rPr>
         <w:t>?</w:t>
       </w:r>
     </w:p>
     <w:p>
       <w:r>
+        <w:rPr>
+          <w:b w:val="0"/>
+          <w:color w:val="000000"/>
+          <w:sz w:val="22"/>
+        </w:rPr>
         <w:t>Il comprend :</w:t>
       </w:r>
     </w:p>
@@ -264,7 +474,12 @@
         <w:pStyle w:val="ListBullet"/>
       </w:pPr>
       <w:r>
-        <w:t>Les r�glements. Ce sont des textes directement int�gr�s dans le droit interne des �tats ; -</w:t>
+        <w:rPr>
+          <w:b w:val="0"/>
+          <w:color w:val="000000"/>
+          <w:sz w:val="22"/>
+        </w:rPr>
+        <w:t>Les reglements. Ce sont des textes directement integres dans le droit interne des etats ;</w:t>
       </w:r>
     </w:p>
     <w:p>
@@ -272,16 +487,31 @@
         <w:pStyle w:val="ListBullet"/>
       </w:pPr>
       <w:r>
-        <w:t>Les directives. Elles fixent des objectifs obligatoires mais laissent les �tats libres quant aux moyens d�y parvenir. -</w:t>
+        <w:rPr>
+          <w:b w:val="0"/>
+          <w:color w:val="000000"/>
+          <w:sz w:val="22"/>
+        </w:rPr>
+        <w:t>Les directives. Elles fixent des objectifs obligatoires mais laissent les etats libres quant aux moyens d'y parvenir.</w:t>
       </w:r>
     </w:p>
     <w:p>
       <w:r>
-        <w:t>Pour exemple la Directive (UE) 2024/2831 relative � l�am�lioration des conditions de travail dans le cadre du travail</w:t>
+        <w:rPr>
+          <w:b w:val="0"/>
+          <w:color w:val="000000"/>
+          <w:sz w:val="22"/>
+        </w:rPr>
+        <w:t>Pour exemple la Directive (UE) 2024/2831 relative e l'amelioration des conditions de travail dans le cadre du travail</w:t>
       </w:r>
     </w:p>
     <w:p>
       <w:r>
+        <w:rPr>
+          <w:b w:val="0"/>
+          <w:color w:val="000000"/>
+          <w:sz w:val="22"/>
+        </w:rPr>
         <w:t>via une plateforme ;</w:t>
       </w:r>
     </w:p>
@@ -290,7 +520,12 @@
         <w:pStyle w:val="ListBullet"/>
       </w:pPr>
       <w:r>
-        <w:t>Les d�cisions. Elles n�ont d�effet qu�� l��gard d�un nombre d�termin� de personnes ; -</w:t>
+        <w:rPr>
+          <w:b w:val="0"/>
+          <w:color w:val="000000"/>
+          <w:sz w:val="22"/>
+        </w:rPr>
+        <w:t>Les d'cisions. Elles n'ont d'effet qu'e l'egard d'un nombre d'termine de personnes ;</w:t>
       </w:r>
     </w:p>
     <w:p>
@@ -298,7 +533,12 @@
         <w:pStyle w:val="ListBullet"/>
       </w:pPr>
       <w:r>
-        <w:t>Les recommandations et avis. Ils n�ont pas de caract�res contraignant � l��gard des �tats. -</w:t>
+        <w:rPr>
+          <w:b w:val="0"/>
+          <w:color w:val="000000"/>
+          <w:sz w:val="22"/>
+        </w:rPr>
+        <w:t>Les recommandations et avis. Ils n'ont pas de caracteres contraignant e l'egard des etats.</w:t>
       </w:r>
     </w:p>
     <w:p>
@@ -306,41 +546,81 @@
         <w:pStyle w:val="Heading2"/>
       </w:pPr>
       <w:r>
-        <w:t>LA JURISPRUDENCE DE L�UNION EUROP�ENNE</w:t>
+        <w:rPr>
+          <w:b/>
+          <w:color w:val="2F5496"/>
+          <w:sz w:val="24"/>
+        </w:rPr>
+        <w:t>LA JURISPRUDENCE DE L'UNION EUROPeENNE</w:t>
       </w:r>
     </w:p>
     <w:p>
       <w:r>
+        <w:rPr>
+          <w:b w:val="0"/>
+          <w:color w:val="000000"/>
+          <w:sz w:val="22"/>
+        </w:rPr>
         <w:t>?</w:t>
       </w:r>
     </w:p>
     <w:p>
       <w:r>
-        <w:t>La Cour de justice de l�Union europ�enne et le tribunal de premi�re instance de l�Union europ�enne sont aussi des</w:t>
+        <w:rPr>
+          <w:b w:val="0"/>
+          <w:color w:val="000000"/>
+          <w:sz w:val="22"/>
+        </w:rPr>
+        <w:t>La Cour de justice de l'Union europeenne et le tribunal de premiere instance de l'Union europeenne sont aussi des</w:t>
       </w:r>
     </w:p>
     <w:p>
       <w:r>
-        <w:t>sources de premier ordre dans la mesure o� leurs d�cisions invitent � une lecture du droit europ�en de nature � avoir une</w:t>
+        <w:rPr>
+          <w:b w:val="0"/>
+          <w:color w:val="000000"/>
+          <w:sz w:val="22"/>
+        </w:rPr>
+        <w:t>sources de premier ordre dans la mesure oe leurs d'cisions invitent e une lecture du droit europeen de nature e avoir une</w:t>
       </w:r>
     </w:p>
     <w:p>
       <w:r>
-        <w:t>incidence dans le droit interne des �tats.</w:t>
+        <w:rPr>
+          <w:b w:val="0"/>
+          <w:color w:val="000000"/>
+          <w:sz w:val="22"/>
+        </w:rPr>
+        <w:t>incidence dans le droit interne des etats.</w:t>
       </w:r>
     </w:p>
     <w:p>
       <w:r>
-        <w:t>Par exemple, et derni�rement, un arr�t pr�cisant les conditions dans lesquelles le temps d�astreinte peut constituer un</w:t>
+        <w:rPr>
+          <w:b w:val="0"/>
+          <w:color w:val="000000"/>
+          <w:sz w:val="22"/>
+        </w:rPr>
+        <w:t>Par exemple, et dernierement, un arret precisant les conditions dans lesquelles le temps d'astreinte peut constituer un</w:t>
       </w:r>
     </w:p>
     <w:p>
       <w:r>
-        <w:t>temps de travail effectif, ou encore les deux arr�ts de la CJUE en date du 14 mars 2017 relatifs au port visible de tout signe</w:t>
+        <w:rPr>
+          <w:b w:val="0"/>
+          <w:color w:val="000000"/>
+          <w:sz w:val="22"/>
+        </w:rPr>
+        <w:t>temps de travail effectif, ou encore les deux arrets de la CJUE en date du 14 mars 2017 relatifs au port visible de tout signe</w:t>
       </w:r>
     </w:p>
     <w:p>
       <w:r>
+        <w:rPr>
+          <w:b w:val="0"/>
+          <w:color w:val="000000"/>
+          <w:sz w:val="22"/>
+        </w:rPr>
         <w:t>politique, philosophique ou religieux en entreprise.</w:t>
       </w:r>
     </w:p>
@@ -350,7 +630,12 @@
         <w:pStyle w:val="Heading2"/>
       </w:pPr>
       <w:r>
-        <w:t>LES SOURCES �TATIQUES II �</w:t>
+        <w:rPr>
+          <w:b/>
+          <w:color w:val="2F5496"/>
+          <w:sz w:val="24"/>
+        </w:rPr>
+        <w:t>LES SOURCES eTATIQUES II e</w:t>
       </w:r>
     </w:p>
     <w:p>
@@ -358,7 +643,12 @@
         <w:pStyle w:val="Heading2"/>
       </w:pPr>
       <w:r>
-        <w:t>LE DOMAINE DE LA LOI A �</w:t>
+        <w:rPr>
+          <w:b/>
+          <w:color w:val="2F5496"/>
+          <w:sz w:val="24"/>
+        </w:rPr>
+        <w:t>LE DOMAINE DE LA LOI A e</w:t>
       </w:r>
     </w:p>
     <w:p>
@@ -366,16 +656,31 @@
         <w:pStyle w:val="Heading2"/>
       </w:pPr>
       <w:r>
-        <w:t>LE BLOC DE CONSTITUTINNALIT�</w:t>
+        <w:rPr>
+          <w:b/>
+          <w:color w:val="2F5496"/>
+          <w:sz w:val="24"/>
+        </w:rPr>
+        <w:t>LE BLOC DE CONSTITUTINNALITe</w:t>
       </w:r>
     </w:p>
     <w:p>
       <w:r>
+        <w:rPr>
+          <w:b w:val="0"/>
+          <w:color w:val="000000"/>
+          <w:sz w:val="22"/>
+        </w:rPr>
         <w:t>?</w:t>
       </w:r>
     </w:p>
     <w:p>
       <w:r>
+        <w:rPr>
+          <w:b w:val="0"/>
+          <w:color w:val="000000"/>
+          <w:sz w:val="22"/>
+        </w:rPr>
         <w:t>Sous ce vocable il faut entendre</w:t>
       </w:r>
     </w:p>
@@ -384,7 +689,12 @@
         <w:pStyle w:val="ListBullet"/>
       </w:pPr>
       <w:r>
-        <w:t>la constitution de 1958 ; -</w:t>
+        <w:rPr>
+          <w:b w:val="0"/>
+          <w:color w:val="000000"/>
+          <w:sz w:val="22"/>
+        </w:rPr>
+        <w:t>la constitution de 1958 ;</w:t>
       </w:r>
     </w:p>
     <w:p>
@@ -392,7 +702,12 @@
         <w:pStyle w:val="ListBullet"/>
       </w:pPr>
       <w:r>
-        <w:t>le pr�ambule de la constitution du 27 octobre 1946 ; -</w:t>
+        <w:rPr>
+          <w:b w:val="0"/>
+          <w:color w:val="000000"/>
+          <w:sz w:val="22"/>
+        </w:rPr>
+        <w:t>le preambule de la constitution du 27 octobre 1946 ;</w:t>
       </w:r>
     </w:p>
     <w:p>
@@ -400,16 +715,31 @@
         <w:pStyle w:val="ListBullet"/>
       </w:pPr>
       <w:r>
-        <w:t>la d�claration des droits de l�homme et du citoyen de 1789 ; -</w:t>
+        <w:rPr>
+          <w:b w:val="0"/>
+          <w:color w:val="000000"/>
+          <w:sz w:val="22"/>
+        </w:rPr>
+        <w:t>la d'claration des droits de l'homme et du citoyen de 1789 ;</w:t>
       </w:r>
     </w:p>
     <w:p>
       <w:r>
-        <w:t>la charte de l�environnement promulgu�e le 1</w:t>
+        <w:rPr>
+          <w:b w:val="0"/>
+          <w:color w:val="000000"/>
+          <w:sz w:val="22"/>
+        </w:rPr>
+        <w:t>la charte de l'environnement promulguee le 1</w:t>
       </w:r>
     </w:p>
     <w:p>
       <w:r>
+        <w:rPr>
+          <w:b w:val="0"/>
+          <w:color w:val="000000"/>
+          <w:sz w:val="22"/>
+        </w:rPr>
         <w:t>er</w:t>
       </w:r>
     </w:p>
@@ -418,27 +748,52 @@
         <w:pStyle w:val="ListBullet"/>
       </w:pPr>
       <w:r>
-        <w:t>mars 2005. -</w:t>
+        <w:rPr>
+          <w:b w:val="0"/>
+          <w:color w:val="000000"/>
+          <w:sz w:val="22"/>
+        </w:rPr>
+        <w:t>mars 2005.</w:t>
       </w:r>
     </w:p>
     <w:p>
       <w:r>
-        <w:t>Chacun de ces textes � valeur constitutionnelle comprend des principes et formule un certain nombre de droits. Par</w:t>
+        <w:rPr>
+          <w:b w:val="0"/>
+          <w:color w:val="000000"/>
+          <w:sz w:val="22"/>
+        </w:rPr>
+        <w:t>Chacun de ces textes e valeur constitutionnelle comprend des principes et formule un certain nombre de droits. Par</w:t>
       </w:r>
     </w:p>
     <w:p>
       <w:r>
-        <w:t>exemple le droit au travail, le droit syndical, le droit de gr�ve ou encore le droit � la s�curit� sociale, figurent dans le</w:t>
+        <w:rPr>
+          <w:b w:val="0"/>
+          <w:color w:val="000000"/>
+          <w:sz w:val="22"/>
+        </w:rPr>
+        <w:t>exemple le droit au travail, le droit syndical, le droit de greve ou encore le droit e la s'curite sociale, figurent dans le</w:t>
       </w:r>
     </w:p>
     <w:p>
       <w:r>
-        <w:t>pr�ambule de 1946. De m�me que le droit de propri�t�, la libert� d�entreprendre ainsi que la libert� du travail sont</w:t>
+        <w:rPr>
+          <w:b w:val="0"/>
+          <w:color w:val="000000"/>
+          <w:sz w:val="22"/>
+        </w:rPr>
+        <w:t>preambule de 1946. De m'me que le droit de propriet', la liberte d'entreprendre ainsi que la liberte du travail sont</w:t>
       </w:r>
     </w:p>
     <w:p>
       <w:r>
-        <w:t>exprim�s dans la d�claration des droits de l�homme.</w:t>
+        <w:rPr>
+          <w:b w:val="0"/>
+          <w:color w:val="000000"/>
+          <w:sz w:val="22"/>
+        </w:rPr>
+        <w:t>exprimes dans la d'claration des droits de l'homme.</w:t>
       </w:r>
     </w:p>
     <w:p>
@@ -446,27 +801,52 @@
         <w:pStyle w:val="Heading2"/>
       </w:pPr>
       <w:r>
+        <w:rPr>
+          <w:b/>
+          <w:color w:val="2F5496"/>
+          <w:sz w:val="24"/>
+        </w:rPr>
         <w:t>LA LOI</w:t>
       </w:r>
     </w:p>
     <w:p>
       <w:r>
+        <w:rPr>
+          <w:b w:val="0"/>
+          <w:color w:val="000000"/>
+          <w:sz w:val="22"/>
+        </w:rPr>
         <w:t>?</w:t>
       </w:r>
     </w:p>
     <w:p>
       <w:r>
-        <w:t>L�article 34 de la constitution d�termine le champ d�application de la loi : � La loi est vot�e par le Parlement� La loi</w:t>
+        <w:rPr>
+          <w:b w:val="0"/>
+          <w:color w:val="000000"/>
+          <w:sz w:val="22"/>
+        </w:rPr>
+        <w:t>L'article 34 de la constitution d'termine le champ d'application de la loi : e La loi est votee par le Parlemente La loi</w:t>
       </w:r>
     </w:p>
     <w:p>
       <w:r>
-        <w:t>d�termine les principes fondamentaux : �du droit du travail, du droit syndical et de la s�curit� sociale. �. Son expression</w:t>
+        <w:rPr>
+          <w:b w:val="0"/>
+          <w:color w:val="000000"/>
+          <w:sz w:val="22"/>
+        </w:rPr>
+        <w:t>d'termine les principes fondamentaux : edu droit du travail, du droit syndical et de la s'curite sociale. e. Son expression</w:t>
       </w:r>
     </w:p>
     <w:p>
       <w:r>
-        <w:t>est organis�e dans le cadre du code du travail et du code de la s�curit� sociale.</w:t>
+        <w:rPr>
+          <w:b w:val="0"/>
+          <w:color w:val="000000"/>
+          <w:sz w:val="22"/>
+        </w:rPr>
+        <w:t>est organisee dans le cadre du code du travail et du code de la s'curite sociale.</w:t>
       </w:r>
     </w:p>
     <w:p>
@@ -474,17 +854,32 @@
         <w:pStyle w:val="Heading2"/>
       </w:pPr>
       <w:r>
-        <w:t>LE DOMAINE R�GLEMENTAIRE B �</w:t>
+        <w:rPr>
+          <w:b/>
+          <w:color w:val="2F5496"/>
+          <w:sz w:val="24"/>
+        </w:rPr>
+        <w:t>LE DOMAINE ReGLEMENTAIRE B e</w:t>
       </w:r>
     </w:p>
     <w:p>
       <w:r>
-        <w:t>Au terme de l�article 37 de la constitution de 1958, les domaines qui ne rel�vent pas de la loi rel�vent du pouvoir</w:t>
+        <w:rPr>
+          <w:b w:val="0"/>
+          <w:color w:val="000000"/>
+          <w:sz w:val="22"/>
+        </w:rPr>
+        <w:t>Au terme de l'article 37 de la constitution de 1958, les domaines qui ne relevent pas de la loi relevent du pouvoir</w:t>
       </w:r>
     </w:p>
     <w:p>
       <w:r>
-        <w:t>r�glementaire.</w:t>
+        <w:rPr>
+          <w:b w:val="0"/>
+          <w:color w:val="000000"/>
+          <w:sz w:val="22"/>
+        </w:rPr>
+        <w:t>reglementaire.</w:t>
       </w:r>
     </w:p>
     <w:p>
@@ -492,31 +887,61 @@
         <w:pStyle w:val="Heading2"/>
       </w:pPr>
       <w:r>
-        <w:t>LE POUVOIR R�GLEMENTAIRE</w:t>
+        <w:rPr>
+          <w:b/>
+          <w:color w:val="2F5496"/>
+          <w:sz w:val="24"/>
+        </w:rPr>
+        <w:t>LE POUVOIR ReGLEMENTAIRE</w:t>
       </w:r>
     </w:p>
     <w:p>
       <w:r>
+        <w:rPr>
+          <w:b w:val="0"/>
+          <w:color w:val="000000"/>
+          <w:sz w:val="22"/>
+        </w:rPr>
         <w:t>?</w:t>
       </w:r>
     </w:p>
     <w:p>
       <w:r>
-        <w:t>L�acte administratif r�glementaire (d�cret, arr�t�, etc.) est une r�gle g�n�rale, �dict�e unilat�ralement par le pouvoir</w:t>
+        <w:rPr>
+          <w:b w:val="0"/>
+          <w:color w:val="000000"/>
+          <w:sz w:val="22"/>
+        </w:rPr>
+        <w:t>L'acte administratif reglementaire (d'cret, arret', etc.) est une regle gen'rale, edictee unilateralement par le pouvoir</w:t>
       </w:r>
     </w:p>
     <w:p>
       <w:r>
-        <w:t>ex�cutif. � ce titre le gouvernement dispose non seulement d�un pouvoir r�glementaire d�application de la loi mais</w:t>
+        <w:rPr>
+          <w:b w:val="0"/>
+          <w:color w:val="000000"/>
+          <w:sz w:val="22"/>
+        </w:rPr>
+        <w:t>executif. e ce titre le gouvernement dispose non seulement d'un pouvoir reglementaire d'application de la loi mais</w:t>
       </w:r>
     </w:p>
     <w:p>
       <w:r>
-        <w:t>encore d�un pouvoir r�glementaire autonome dans toutes les mati�res qui ne sont pas attribu�es � la loi par la</w:t>
+        <w:rPr>
+          <w:b w:val="0"/>
+          <w:color w:val="000000"/>
+          <w:sz w:val="22"/>
+        </w:rPr>
+        <w:t>encore d'un pouvoir reglementaire autonome dans toutes les matieres qui ne sont pas attribuees e la loi par la</w:t>
       </w:r>
     </w:p>
     <w:p>
       <w:r>
+        <w:rPr>
+          <w:b w:val="0"/>
+          <w:color w:val="000000"/>
+          <w:sz w:val="22"/>
+        </w:rPr>
         <w:t>Constitution.</w:t>
       </w:r>
     </w:p>
@@ -525,27 +950,52 @@
         <w:pStyle w:val="Heading2"/>
       </w:pPr>
       <w:r>
+        <w:rPr>
+          <w:b/>
+          <w:color w:val="C0504D"/>
+          <w:sz w:val="24"/>
+        </w:rPr>
         <w:t>EXCEPTION : LES ORDONNANCES</w:t>
       </w:r>
     </w:p>
     <w:p>
       <w:r>
+        <w:rPr>
+          <w:b w:val="0"/>
+          <w:color w:val="C0504D"/>
+          <w:sz w:val="22"/>
+        </w:rPr>
         <w:t>?</w:t>
       </w:r>
     </w:p>
     <w:p>
       <w:r>
+        <w:rPr>
+          <w:b w:val="0"/>
+          <w:color w:val="C0504D"/>
+          <w:sz w:val="22"/>
+        </w:rPr>
         <w:t>Ce sont des textes pris par le gouvernement sur habilitation du Parlement car les dispositions qui peuvent y figurer</w:t>
       </w:r>
     </w:p>
     <w:p>
       <w:r>
-        <w:t>rel�vent �ventuellement du domaine de la loi. Par exemple, les ordonnances dites � Macron � du 22 septembre 2017 ou</w:t>
+        <w:rPr>
+          <w:b w:val="0"/>
+          <w:color w:val="C0504D"/>
+          <w:sz w:val="22"/>
+        </w:rPr>
+        <w:t>relevent eventuellement du domaine de la loi. Par exemple, les ordonnances dites e Macron e du 22 septembre 2017 ou</w:t>
       </w:r>
     </w:p>
     <w:p>
       <w:r>
-        <w:t>encore celles des 3, 10 et 17 juin 2020 pour faire face � l��pid�mie de COVID.</w:t>
+        <w:rPr>
+          <w:b w:val="0"/>
+          <w:color w:val="C0504D"/>
+          <w:sz w:val="22"/>
+        </w:rPr>
+        <w:t>encore celles des 3, 10 et 17 juin 2020 pour faire face e l'epidemie de COVID.</w:t>
       </w:r>
     </w:p>
     <w:p>
@@ -553,32 +1003,62 @@
         <w:pStyle w:val="Heading2"/>
       </w:pPr>
       <w:r>
-        <w:t>LA JURISPRUDENCE C �</w:t>
+        <w:rPr>
+          <w:b/>
+          <w:color w:val="2F5496"/>
+          <w:sz w:val="24"/>
+        </w:rPr>
+        <w:t>LA JURISPRUDENCE C e</w:t>
       </w:r>
     </w:p>
     <w:p>
       <w:r>
-        <w:t>C�est une source particuli�rement importante �tant donn� le nombre de litiges port�s devant les juridictions sociales.</w:t>
+        <w:rPr>
+          <w:b w:val="0"/>
+          <w:color w:val="000000"/>
+          <w:sz w:val="22"/>
+        </w:rPr>
+        <w:t>C'est une source particulierement importante etant donne le nombre de litiges portes devant les juridictions sociales.</w:t>
       </w:r>
     </w:p>
     <w:p>
       <w:r>
-        <w:t>La chambre sociale de la Cour de cassation est ainsi � l�origine d�une importante jurisprudence qui impose une veille</w:t>
+        <w:rPr>
+          <w:b w:val="0"/>
+          <w:color w:val="000000"/>
+          <w:sz w:val="22"/>
+        </w:rPr>
+        <w:t>La chambre sociale de la Cour de cassation est ainsi e l'origine d'une importante jurisprudence qui impose une veille</w:t>
       </w:r>
     </w:p>
     <w:p>
       <w:r>
-        <w:t>juridique constante. Les d�cisions de la chambre criminelle de la Cour de cassation mais aussi des juridictions adminis-</w:t>
+        <w:rPr>
+          <w:b w:val="0"/>
+          <w:color w:val="000000"/>
+          <w:sz w:val="22"/>
+        </w:rPr>
+        <w:t>juridique constante. Les d'cisions de la chambre criminelle de la Cour de cassation mais aussi des juridictions adminis-</w:t>
       </w:r>
     </w:p>
     <w:p>
       <w:r>
-        <w:t>tratives doivent faire l�objet de la m�me attention dans la mesure ou certains litiges du droit social peuvent relever de</w:t>
+        <w:rPr>
+          <w:b w:val="0"/>
+          <w:color w:val="000000"/>
+          <w:sz w:val="22"/>
+        </w:rPr>
+        <w:t>tratives doivent faire l'objet de la m'me attention dans la mesure ou certains litiges du droit social peuvent relever de</w:t>
       </w:r>
     </w:p>
     <w:p>
       <w:r>
-        <w:t>leur comp�tence (infractions relatives au droit du travail, licenciement des repr�sentants du personnel�).</w:t>
+        <w:rPr>
+          <w:b w:val="0"/>
+          <w:color w:val="000000"/>
+          <w:sz w:val="22"/>
+        </w:rPr>
+        <w:t>leur competence (infractions relatives au droit du travail, licenciement des representants du personnele).</w:t>
       </w:r>
     </w:p>
     <w:p>
@@ -586,7 +1066,12 @@
         <w:pStyle w:val="Heading2"/>
       </w:pPr>
       <w:r>
-        <w:t>LES SOURCES PROFESSIONNELLES III �</w:t>
+        <w:rPr>
+          <w:b/>
+          <w:color w:val="2F5496"/>
+          <w:sz w:val="24"/>
+        </w:rPr>
+        <w:t>LES SOURCES PROFESSIONNELLES III e</w:t>
       </w:r>
     </w:p>
     <w:p>
@@ -594,22 +1079,42 @@
         <w:pStyle w:val="Heading2"/>
       </w:pPr>
       <w:r>
-        <w:t>LES CONVENTIONS ET ACCORDS COLLECTIFS A �</w:t>
+        <w:rPr>
+          <w:b/>
+          <w:color w:val="2F5496"/>
+          <w:sz w:val="24"/>
+        </w:rPr>
+        <w:t>LES CONVENTIONS ET ACCORDS COLLECTIFS A e</w:t>
       </w:r>
     </w:p>
     <w:p>
       <w:r>
-        <w:t>Le droit des salari�s de participer � la d�termination de leurs conditions de travail est un principe inscrit dans le pr�am-</w:t>
+        <w:rPr>
+          <w:b w:val="0"/>
+          <w:color w:val="000000"/>
+          <w:sz w:val="22"/>
+        </w:rPr>
+        <w:t>Le droit des salaries de participer e la d'termination de leurs conditions de travail est un principe inscrit dans le pream-</w:t>
       </w:r>
     </w:p>
     <w:p>
       <w:r>
-        <w:t>bule de la constitution de 1946. Ce droit particuli�rement important s�exerce dans le cadre de la n�gociation collective</w:t>
+        <w:rPr>
+          <w:b w:val="0"/>
+          <w:color w:val="000000"/>
+          <w:sz w:val="22"/>
+        </w:rPr>
+        <w:t>bule de la constitution de 1946. Ce droit particulierement important s'exerce dans le cadre de la n'gociation collective</w:t>
       </w:r>
     </w:p>
     <w:p>
       <w:r>
-        <w:t>aux fins d�aboutir � la conclusion de conventions ou d�accords collectifs.</w:t>
+        <w:rPr>
+          <w:b w:val="0"/>
+          <w:color w:val="000000"/>
+          <w:sz w:val="22"/>
+        </w:rPr>
+        <w:t>aux fins d'aboutir e la conclusion de conventions ou d'accords collectifs.</w:t>
       </w:r>
     </w:p>
     <w:p>
@@ -617,7 +1122,12 @@
         <w:pStyle w:val="ListBullet"/>
       </w:pPr>
       <w:r>
-        <w:t>les conventions collectives concernent l�ensemble des conditions de travail ; -</w:t>
+        <w:rPr>
+          <w:b w:val="0"/>
+          <w:color w:val="000000"/>
+          <w:sz w:val="22"/>
+        </w:rPr>
+        <w:t>les conventions collectives concernent l'ensemble des conditions de travail ;</w:t>
       </w:r>
     </w:p>
     <w:p>
@@ -625,37 +1135,72 @@
         <w:pStyle w:val="ListBullet"/>
       </w:pPr>
       <w:r>
-        <w:t>les accords collectifs n�en visent qu�un aspect particulier (formation professionnelle, salaires�). -</w:t>
+        <w:rPr>
+          <w:b w:val="0"/>
+          <w:color w:val="000000"/>
+          <w:sz w:val="22"/>
+        </w:rPr>
+        <w:t>les accords collectifs n'en visent qu'un aspect particulier (formation professionnelle, salairese).</w:t>
       </w:r>
     </w:p>
     <w:p>
       <w:r>
-        <w:t>Tous deux sont n�goci�s entre un employeur ou un groupement d�employeurs et une ou plusieurs organisations</w:t>
+        <w:rPr>
+          <w:b w:val="0"/>
+          <w:color w:val="000000"/>
+          <w:sz w:val="22"/>
+        </w:rPr>
+        <w:t>Tous deux sont n'gocies entre un employeur ou un groupement d'employeurs et une ou plusieurs organisations</w:t>
       </w:r>
     </w:p>
     <w:p>
       <w:r>
-        <w:t>syndicales repr�sentatives de salari�s.</w:t>
+        <w:rPr>
+          <w:b w:val="0"/>
+          <w:color w:val="000000"/>
+          <w:sz w:val="22"/>
+        </w:rPr>
+        <w:t>syndicales representatives de salaries.</w:t>
       </w:r>
     </w:p>
     <w:p>
       <w:r>
-        <w:t>Ils peuvent �tre conclus niveau de la branche (c�est-�-dire dans une branche d�activit�, chimie ou m�tallurgie par exem-</w:t>
+        <w:rPr>
+          <w:b w:val="0"/>
+          <w:color w:val="000000"/>
+          <w:sz w:val="22"/>
+        </w:rPr>
+        <w:t>Ils peuvent etre conclus niveau de la branche (c'est-e-dire dans une branche d'activite, chimie ou m'tallurgie par exem-</w:t>
       </w:r>
     </w:p>
     <w:p>
       <w:r>
-        <w:t>ple), au niveau de l�entreprise (entreprise et �tablissement) et au niveau interprofessionnel.</w:t>
+        <w:rPr>
+          <w:b w:val="0"/>
+          <w:color w:val="000000"/>
+          <w:sz w:val="22"/>
+        </w:rPr>
+        <w:t>ple), au niveau de l'entreprise (entreprise et etablissement) et au niveau interprofessionnel.</w:t>
       </w:r>
     </w:p>
     <w:p>
       <w:r>
-        <w:t>En outre, les conventions et accords de branche ou interprofessionnel peuvent �tre d�limit�s g�ographiquement et �tre</w:t>
+        <w:rPr>
+          <w:b w:val="0"/>
+          <w:color w:val="000000"/>
+          <w:sz w:val="22"/>
+        </w:rPr>
+        <w:t>En outre, les conventions et accords de branche ou interprofessionnel peuvent etre d'limites geographiquement et etre</w:t>
       </w:r>
     </w:p>
     <w:p>
       <w:r>
-        <w:t>conclus au niveau national, r�gional ou local.</w:t>
+        <w:rPr>
+          <w:b w:val="0"/>
+          <w:color w:val="000000"/>
+          <w:sz w:val="22"/>
+        </w:rPr>
+        <w:t>conclus au niveau national, regional ou local.</w:t>
       </w:r>
     </w:p>
     <w:p>
@@ -663,7 +1208,12 @@
         <w:pStyle w:val="Heading2"/>
       </w:pPr>
       <w:r>
-        <w:t>R�GLEMENTS ET ACTES UNILAT�RAUX B �</w:t>
+        <w:rPr>
+          <w:b/>
+          <w:color w:val="2F5496"/>
+          <w:sz w:val="24"/>
+        </w:rPr>
+        <w:t>ReGLEMENTS ET ACTES UNILATeRAUX B e</w:t>
       </w:r>
     </w:p>
     <w:p>
@@ -671,32 +1221,62 @@
         <w:pStyle w:val="Heading2"/>
       </w:pPr>
       <w:r>
-        <w:t>LE R�GLEMENT INT�RIEUR</w:t>
+        <w:rPr>
+          <w:b/>
+          <w:color w:val="2F5496"/>
+          <w:sz w:val="24"/>
+        </w:rPr>
+        <w:t>LE ReGLEMENT INTeRIEUR</w:t>
       </w:r>
     </w:p>
     <w:p>
       <w:r>
+        <w:rPr>
+          <w:b w:val="0"/>
+          <w:color w:val="000000"/>
+          <w:sz w:val="22"/>
+        </w:rPr>
         <w:t>?</w:t>
       </w:r>
     </w:p>
     <w:p>
       <w:r>
-        <w:t>L��laboration d�un r�glement int�rieur constitue une obligation l�gale dans les entreprises employant au moins 20</w:t>
+        <w:rPr>
+          <w:b w:val="0"/>
+          <w:color w:val="000000"/>
+          <w:sz w:val="22"/>
+        </w:rPr>
+        <w:t>L'elaboration d'un reglement interieur constitue une obligation l'gale dans les entreprises employant au moins 20</w:t>
       </w:r>
     </w:p>
     <w:p>
       <w:r>
-        <w:t>salari�s. Son contenu est limitatif puisqu�il ne peut contenir que des dispositions relatives � l�hygi�ne et la s�curit� ainsi</w:t>
+        <w:rPr>
+          <w:b w:val="0"/>
+          <w:color w:val="000000"/>
+          <w:sz w:val="22"/>
+        </w:rPr>
+        <w:t>salaries. Son contenu est limitatif puisqu'il ne peut contenir que des dispositions relatives e l'hygiene et la s'curite ainsi</w:t>
       </w:r>
     </w:p>
     <w:p>
       <w:r>
-        <w:t>qu�� la discipline dans l�entreprise. Il rappelle en outres les dispositions relatives au harc�lement. Sa violation peut</w:t>
+        <w:rPr>
+          <w:b w:val="0"/>
+          <w:color w:val="000000"/>
+          <w:sz w:val="22"/>
+        </w:rPr>
+        <w:t>qu'e la discipline dans l'entreprise. Il rappelle en outres les dispositions relatives au harcelement. Sa violation peut</w:t>
       </w:r>
     </w:p>
     <w:p>
       <w:r>
-        <w:t>entra�ner l�application de sanctions disciplinaires�;</w:t>
+        <w:rPr>
+          <w:b w:val="0"/>
+          <w:color w:val="000000"/>
+          <w:sz w:val="22"/>
+        </w:rPr>
+        <w:t>entraener l'application de sanctions disciplinairese;</w:t>
       </w:r>
     </w:p>
     <w:p/>
@@ -705,27 +1285,52 @@
         <w:pStyle w:val="Heading2"/>
       </w:pPr>
       <w:r>
+        <w:rPr>
+          <w:b/>
+          <w:color w:val="2F5496"/>
+          <w:sz w:val="24"/>
+        </w:rPr>
         <w:t>LES RECOMMANDATIONS PATRONALES</w:t>
       </w:r>
     </w:p>
     <w:p>
       <w:r>
+        <w:rPr>
+          <w:b w:val="0"/>
+          <w:color w:val="000000"/>
+          <w:sz w:val="22"/>
+        </w:rPr>
         <w:t>?</w:t>
       </w:r>
     </w:p>
     <w:p>
       <w:r>
-        <w:t>Les organisations syndicales patronales peuvent s�adresser directement � leurs adh�rents sous la forme de</w:t>
+        <w:rPr>
+          <w:b w:val="0"/>
+          <w:color w:val="000000"/>
+          <w:sz w:val="22"/>
+        </w:rPr>
+        <w:t>Les organisations syndicales patronales peuvent s'adresser directement e leurs adherents sous la forme de</w:t>
       </w:r>
     </w:p>
     <w:p>
       <w:r>
-        <w:t>recommandations. La Cour de cassation par une d�cision en date 29 juin 1999 leur reconna�t force obligatoire � l��gard</w:t>
+        <w:rPr>
+          <w:b w:val="0"/>
+          <w:color w:val="000000"/>
+          <w:sz w:val="22"/>
+        </w:rPr>
+        <w:t>recommandations. La Cour de cassation par une d'cision en date 29 juin 1999 leur reconnaet force obligatoire e l'egard</w:t>
       </w:r>
     </w:p>
     <w:p>
       <w:r>
-        <w:t>de ses adh�rents d�s lors qu�elle rev�t la forme d�une d�claration claire et pr�cise.</w:t>
+        <w:rPr>
+          <w:b w:val="0"/>
+          <w:color w:val="000000"/>
+          <w:sz w:val="22"/>
+        </w:rPr>
+        <w:t>de ses adherents d's lors qu'elle revet la forme d'une d'claration claire et precise.</w:t>
       </w:r>
     </w:p>
     <w:p>
@@ -733,32 +1338,62 @@
         <w:pStyle w:val="Heading2"/>
       </w:pPr>
       <w:r>
-        <w:t>LES ENGAGEMENTS UNILAT�RAUX DE L�EMPLOYEUR</w:t>
+        <w:rPr>
+          <w:b/>
+          <w:color w:val="2F5496"/>
+          <w:sz w:val="24"/>
+        </w:rPr>
+        <w:t>LES ENGAGEMENTS UNILATeRAUX DE L'EMPLOYEUR</w:t>
       </w:r>
     </w:p>
     <w:p>
       <w:r>
+        <w:rPr>
+          <w:b w:val="0"/>
+          <w:color w:val="000000"/>
+          <w:sz w:val="22"/>
+        </w:rPr>
         <w:t>?</w:t>
       </w:r>
     </w:p>
     <w:p>
       <w:r>
-        <w:t>Ce sont les prises d�engagements unilat�rales de l�employeur qui peuvent r�sulter de notes de services, des r�ponses aux</w:t>
+        <w:rPr>
+          <w:b w:val="0"/>
+          <w:color w:val="000000"/>
+          <w:sz w:val="22"/>
+        </w:rPr>
+        <w:t>Ce sont les prises d'engagements unilaterales de l'employeur qui peuvent resulter de notes de services, des reponses aux</w:t>
       </w:r>
     </w:p>
     <w:p>
       <w:r>
-        <w:t>repr�sentants du personnel ou d�une simple d�claration du chef d�entreprise. La jurisprudence leur conf�re un caract�re</w:t>
+        <w:rPr>
+          <w:b w:val="0"/>
+          <w:color w:val="000000"/>
+          <w:sz w:val="22"/>
+        </w:rPr>
+        <w:t>representants du personnel ou d'une simple d'claration du chef d'entreprise. La jurisprudence leur confere un caractere</w:t>
       </w:r>
     </w:p>
     <w:p>
       <w:r>
-        <w:t>obligatoire et leur attribue en tant qu�accords atypiques la proc�dure de d�nonciation applicable aux usages d�s lors</w:t>
+        <w:rPr>
+          <w:b w:val="0"/>
+          <w:color w:val="000000"/>
+          <w:sz w:val="22"/>
+        </w:rPr>
+        <w:t>obligatoire et leur attribue en tant qu'accords atypiques la procedure de d'nonciation applicable aux usages d's lors</w:t>
       </w:r>
     </w:p>
     <w:p>
       <w:r>
-        <w:t>qu�il est a dur� ind�termin�e.</w:t>
+        <w:rPr>
+          <w:b w:val="0"/>
+          <w:color w:val="000000"/>
+          <w:sz w:val="22"/>
+        </w:rPr>
+        <w:t>qu'il est a dure indeterminee.</w:t>
       </w:r>
     </w:p>
     <w:p>
@@ -766,11 +1401,21 @@
         <w:pStyle w:val="Heading2"/>
       </w:pPr>
       <w:r>
-        <w:t>LES USAGES C �</w:t>
+        <w:rPr>
+          <w:b/>
+          <w:color w:val="2F5496"/>
+          <w:sz w:val="24"/>
+        </w:rPr>
+        <w:t>LES USAGES C e</w:t>
       </w:r>
     </w:p>
     <w:p>
       <w:r>
+        <w:rPr>
+          <w:b w:val="0"/>
+          <w:color w:val="000000"/>
+          <w:sz w:val="22"/>
+        </w:rPr>
         <w:t>On distingue :</w:t>
       </w:r>
     </w:p>
@@ -779,7 +1424,12 @@
         <w:pStyle w:val="ListBullet"/>
       </w:pPr>
       <w:r>
-        <w:t>l�usage professionnel qui s�applique � tout ou partie du personnel dans une profession d�termin�e ; -</w:t>
+        <w:rPr>
+          <w:b w:val="0"/>
+          <w:color w:val="000000"/>
+          <w:sz w:val="22"/>
+        </w:rPr>
+        <w:t>l'usage professionnel qui s'applique e tout ou partie du personnel dans une profession d'terminee ;</w:t>
       </w:r>
     </w:p>
     <w:p>
@@ -787,16 +1437,31 @@
         <w:pStyle w:val="ListBullet"/>
       </w:pPr>
       <w:r>
-        <w:t>l�usage d�entreprise qui constitue une pratique habituelle de l�employeur. -</w:t>
+        <w:rPr>
+          <w:b w:val="0"/>
+          <w:color w:val="000000"/>
+          <w:sz w:val="22"/>
+        </w:rPr>
+        <w:t>l'usage d'entreprise qui constitue une pratique habituelle de l'employeur.</w:t>
       </w:r>
     </w:p>
     <w:p>
       <w:r>
-        <w:t>L�usage a un caract�re contraignant pour l�employeur d�s lors qu�il peut �tre �tabli par celui qui l�invoque les caract�res</w:t>
+        <w:rPr>
+          <w:b w:val="0"/>
+          <w:color w:val="000000"/>
+          <w:sz w:val="22"/>
+        </w:rPr>
+        <w:t>L'usage a un caractere contraignant pour l'employeur d's lors qu'il peut etre etabli par celui qui l'invoque les caracteres</w:t>
       </w:r>
     </w:p>
     <w:p>
       <w:r>
+        <w:rPr>
+          <w:b w:val="0"/>
+          <w:color w:val="000000"/>
+          <w:sz w:val="22"/>
+        </w:rPr>
         <w:t>suivants :</w:t>
       </w:r>
     </w:p>
@@ -805,7 +1470,12 @@
         <w:pStyle w:val="ListBullet"/>
       </w:pPr>
       <w:r>
-        <w:t>caract�re de fixit� (l�usage repose sur des modalit�s d�application identiques) ; -</w:t>
+        <w:rPr>
+          <w:b w:val="0"/>
+          <w:color w:val="000000"/>
+          <w:sz w:val="22"/>
+        </w:rPr>
+        <w:t>caractere de fixite (l'usage repose sur des modalites d'application identiques) ;</w:t>
       </w:r>
     </w:p>
     <w:p>
@@ -813,7 +1483,12 @@
         <w:pStyle w:val="ListBullet"/>
       </w:pPr>
       <w:r>
-        <w:t>caract�re de constance (r�gularit� de l�usage) ; -</w:t>
+        <w:rPr>
+          <w:b w:val="0"/>
+          <w:color w:val="000000"/>
+          <w:sz w:val="22"/>
+        </w:rPr>
+        <w:t>caractere de constance (regularite de l'usage) ;</w:t>
       </w:r>
     </w:p>
     <w:p>
@@ -821,17 +1496,32 @@
         <w:pStyle w:val="ListBullet"/>
       </w:pPr>
       <w:r>
-        <w:t>caract�re de g�n�ralit� (l�usage b�n�ficie � la totalit� des salari�s ou une partie d�entre eux). -</w:t>
+        <w:rPr>
+          <w:b w:val="0"/>
+          <w:color w:val="000000"/>
+          <w:sz w:val="22"/>
+        </w:rPr>
+        <w:t>caractere de gen'ralite (l'usage ben'ficie e la totalite des salaries ou une partie d'entre eux).</w:t>
       </w:r>
     </w:p>
     <w:p>
       <w:r>
-        <w:t>La d�nonciation de l�usage par l�employeur ne peut �tre mise en �uvre unilat�ralement sans avoir respect� la</w:t>
+        <w:rPr>
+          <w:b w:val="0"/>
+          <w:color w:val="000000"/>
+          <w:sz w:val="22"/>
+        </w:rPr>
+        <w:t>La d'nonciation de l'usage par l'employeur ne peut etre mise en euvre unilateralement sans avoir respecte la</w:t>
       </w:r>
     </w:p>
     <w:p>
       <w:r>
-        <w:t>proc�dure suivante :</w:t>
+        <w:rPr>
+          <w:b w:val="0"/>
+          <w:color w:val="000000"/>
+          <w:sz w:val="22"/>
+        </w:rPr>
+        <w:t>procedure suivante :</w:t>
       </w:r>
     </w:p>
     <w:p>
@@ -839,7 +1529,12 @@
         <w:pStyle w:val="ListBullet"/>
       </w:pPr>
       <w:r>
-        <w:t>l�information au pr�alable les institutions repr�sentatives du personnel ; -</w:t>
+        <w:rPr>
+          <w:b w:val="0"/>
+          <w:color w:val="000000"/>
+          <w:sz w:val="22"/>
+        </w:rPr>
+        <w:t>l'information au prealable les institutions representatives du personnel ;</w:t>
       </w:r>
     </w:p>
     <w:p>
@@ -847,12 +1542,22 @@
         <w:pStyle w:val="ListBullet"/>
       </w:pPr>
       <w:r>
-        <w:t>l�information au pr�alable et individuellement de chaque salari� concern� par l�usage ; -</w:t>
+        <w:rPr>
+          <w:b w:val="0"/>
+          <w:color w:val="000000"/>
+          <w:sz w:val="22"/>
+        </w:rPr>
+        <w:t>l'information au prealable et individuellement de chaque salarie concerne par l'usage ;</w:t>
       </w:r>
     </w:p>
     <w:p>
       <w:r>
-        <w:t>l�observation d�un d�lai de pr�venance suffisant entre ces informations et la suppression effective de l�usage</w:t>
+        <w:rPr>
+          <w:b w:val="0"/>
+          <w:color w:val="000000"/>
+          <w:sz w:val="22"/>
+        </w:rPr>
+        <w:t>l'observation d'un d'lai de prevenance suffisant entre ces informations et la suppression effective de l'usage</w:t>
       </w:r>
     </w:p>
     <w:p/>

</xml_diff>

<commit_message>
Refait la mise en forme des fiches et corrige les caracteres
Co-authored-by: Eva <urdirditfurd@users.noreply.github.com>
</commit_message>
<xml_diff>
--- a/droit social dcg/1- sources du droit social.docx
+++ b/droit social dcg/1- sources du droit social.docx
@@ -27,7 +27,7 @@
           <w:color w:val="2F5496"/>
           <w:sz w:val="24"/>
         </w:rPr>
-        <w:t>LES SOURCES INTERNATIONALES ET COMMUNAUTAIRES I e</w:t>
+        <w:t>LES SOURCES INTERNATIONALES ET COMMUNAUTAIRES I •</w:t>
       </w:r>
     </w:p>
     <w:p>
@@ -40,7 +40,7 @@
           <w:color w:val="2F5496"/>
           <w:sz w:val="24"/>
         </w:rPr>
-        <w:t>LES ACCORDS INTERNATIONAUX A e</w:t>
+        <w:t>LES ACCORDS INTERNATIONAUX A •</w:t>
       </w:r>
     </w:p>
     <w:p>
@@ -73,7 +73,7 @@
           <w:color w:val="000000"/>
           <w:sz w:val="22"/>
         </w:rPr>
-        <w:t>Les accords internationaux, sous la forme de traites, sont une source importante du droit social, non pas tant du fait de</w:t>
+        <w:t>Les accords internationaux, sous la forme de traités, sont une source importante du droit social, non pas tant du fait de</w:t>
       </w:r>
     </w:p>
     <w:p>
@@ -83,7 +83,7 @@
           <w:color w:val="000000"/>
           <w:sz w:val="22"/>
         </w:rPr>
-        <w:t>leur abondance mais e cause de leurs effets dans le droit interne</w:t>
+        <w:t>leur abondance mais à cause de leurs effets dans le droit interne</w:t>
       </w:r>
     </w:p>
     <w:p>
@@ -93,7 +93,7 @@
           <w:color w:val="000000"/>
           <w:sz w:val="22"/>
         </w:rPr>
-        <w:t>Au niveau international, c'est l'Organisation Internationale du Travail (OIT), qui joue un rele de premier plan. Elle a</w:t>
+        <w:t>Au niveau international, c'est l'Organisation Internationale du Travail (OIT), qui joue un rôle de premier plan. Elle a</w:t>
       </w:r>
     </w:p>
     <w:p>
@@ -103,7 +103,7 @@
           <w:color w:val="000000"/>
           <w:sz w:val="22"/>
         </w:rPr>
-        <w:t>vocation e edicter des normes de nature e ameliorer les conditions de travail dans le monde et par l' m'me d'unifier, pas</w:t>
+        <w:t>vocation à édicter des normes de nature à améliorer les conditions de travail dans le monde et par là même d'unifier, pas</w:t>
       </w:r>
     </w:p>
     <w:p>
@@ -113,7 +113,7 @@
           <w:color w:val="000000"/>
           <w:sz w:val="22"/>
         </w:rPr>
-        <w:t>e pas, les droits sociaux des pays membres. Elle produit aussi un travail documentaire de premier ordre en matiere de</w:t>
+        <w:t>à pas, les droits sociaux des pays membres. Elle produit aussi un travail documentaire de premier ordre en matière de</w:t>
       </w:r>
     </w:p>
     <w:p>
@@ -123,7 +123,7 @@
           <w:color w:val="000000"/>
           <w:sz w:val="22"/>
         </w:rPr>
-        <w:t>reglementation du travail et de protection sociale dans le monde (cf. Rapport 2020 de la Commission d'experts pour</w:t>
+        <w:t>réglementation du travail et de protection sociale dans le monde (cf. Rapport 2020 de la Commission d'experts pour</w:t>
       </w:r>
     </w:p>
     <w:p>
@@ -156,7 +156,7 @@
           <w:color w:val="000000"/>
           <w:sz w:val="22"/>
         </w:rPr>
-        <w:t>La Conference internationale du travail. C'est le parlement de l'organisation.</w:t>
+        <w:t>La Conférence internationale du travail. C'est le parlement de l'organisation.</w:t>
       </w:r>
     </w:p>
     <w:p>
@@ -169,7 +169,7 @@
           <w:color w:val="000000"/>
           <w:sz w:val="22"/>
         </w:rPr>
-        <w:t>Le Conseil d'administration qui constitue l'organe executif.</w:t>
+        <w:t>Le Conseil d'administration qui constitue l'organe exécutif.</w:t>
       </w:r>
     </w:p>
     <w:p>
@@ -182,7 +182,7 @@
           <w:color w:val="000000"/>
           <w:sz w:val="22"/>
         </w:rPr>
-        <w:t>Le Bureau international du travail (BIT). Il constitue le secretariat permanent de l'OIT et prepare les projets</w:t>
+        <w:t>Le Bureau international du travail (BIT). Il constitue le secrétariat permanent de l'OIT et prépare les projets</w:t>
       </w:r>
     </w:p>
     <w:p>
@@ -202,7 +202,7 @@
           <w:color w:val="000000"/>
           <w:sz w:val="22"/>
         </w:rPr>
-        <w:t>Elle intervient en utilisant differents instruments juridiques :</w:t>
+        <w:t>Elle intervient en utilisant différents instruments juridiques :</w:t>
       </w:r>
     </w:p>
     <w:p>
@@ -215,7 +215,7 @@
           <w:color w:val="000000"/>
           <w:sz w:val="22"/>
         </w:rPr>
-        <w:t>Les conventions, qui, une fois ratifiees par les etats, creent e leur charge des obligations. Par exemple, la convention</w:t>
+        <w:t>Les conventions, qui, une fois ratifiées par les états, créent à leur charge des obligations. Par exemple, la convention</w:t>
       </w:r>
     </w:p>
     <w:p>
@@ -225,7 +225,7 @@
           <w:color w:val="000000"/>
           <w:sz w:val="22"/>
         </w:rPr>
-        <w:t>concernant l'elimination de la violence et du harcelement dans le monde du travail, adoptee par la conference e sa</w:t>
+        <w:t>concernant l'élimination de la violence et du harcèlement dans le monde du travail, adoptée par la conférence à sa</w:t>
       </w:r>
     </w:p>
     <w:p>
@@ -235,7 +235,7 @@
           <w:color w:val="000000"/>
           <w:sz w:val="22"/>
         </w:rPr>
-        <w:t>cent huitieme session ( Geneve, 21 juin 2019).</w:t>
+        <w:t>cent huitième session ( Genève, 21 juin 2019).</w:t>
       </w:r>
     </w:p>
     <w:p>
@@ -248,7 +248,7 @@
           <w:color w:val="000000"/>
           <w:sz w:val="22"/>
         </w:rPr>
-        <w:t>Les recommandations, qui constituent un droit mou, dans la mesure oe elles se contentent de d'finir des objectifs</w:t>
+        <w:t>Les recommandations, qui constituent un droit mou, dans la mesure où elles se contentent de définir des objectifs</w:t>
       </w:r>
     </w:p>
     <w:p>
@@ -258,7 +258,7 @@
           <w:color w:val="000000"/>
           <w:sz w:val="22"/>
         </w:rPr>
-        <w:t>(ex. : Recommandation (n' 205) sur l'emploi et le travail d'cent pour la paix et la resilience, 2017).</w:t>
+        <w:t>(ex. : Recommandation (n° 205) sur l'emploi et le travail décent pour la paix et la résilience, 2017).</w:t>
       </w:r>
     </w:p>
     <w:p>
@@ -271,7 +271,7 @@
           <w:color w:val="2F5496"/>
           <w:sz w:val="24"/>
         </w:rPr>
-        <w:t>LE DROIT EUROPeEN NON COMMUNAUTAIRE</w:t>
+        <w:t>LE DROIT EUROPÉEN NON COMMUNAUTAIRE</w:t>
       </w:r>
     </w:p>
     <w:p>
@@ -301,7 +301,7 @@
           <w:color w:val="000000"/>
           <w:sz w:val="22"/>
         </w:rPr>
-        <w:t>organisation e dimension paneuropeenne qui regroupe 47 etats membres dont l'objectif est de promouvoir en Europe</w:t>
+        <w:t>organisation à dimension paneuropéenne qui regroupe 47 états membres dont l'objectif est de promouvoir en Europe</w:t>
       </w:r>
     </w:p>
     <w:p>
@@ -311,7 +311,7 @@
           <w:color w:val="000000"/>
           <w:sz w:val="22"/>
         </w:rPr>
-        <w:t>les valeurs d'mocratiques. En matiere de droit social deux textes sont particulierement importants :</w:t>
+        <w:t>les valeurs démocratiques. En matière de droit social deux textes sont particulièrement importants :</w:t>
       </w:r>
     </w:p>
     <w:p>
@@ -324,7 +324,7 @@
           <w:color w:val="000000"/>
           <w:sz w:val="22"/>
         </w:rPr>
-        <w:t>La convention de sauvegarde des droits de l'homme entree en vigueur en 1953.</w:t>
+        <w:t>La convention de sauvegarde des droits de l'homme entrée en vigueur en 1953.</w:t>
       </w:r>
     </w:p>
     <w:p>
@@ -337,7 +337,7 @@
           <w:color w:val="000000"/>
           <w:sz w:val="22"/>
         </w:rPr>
-        <w:t>La charte sociale europeenne signee en 1961 et revisee en 1996.</w:t>
+        <w:t>La charte sociale européenne signée en 1961 et révisée en 1996.</w:t>
       </w:r>
     </w:p>
     <w:p>
@@ -350,7 +350,7 @@
           <w:color w:val="2F5496"/>
           <w:sz w:val="24"/>
         </w:rPr>
-        <w:t>LE DROIT DE L'UNION EUROPeENNE B e</w:t>
+        <w:t>LE DROIT DE L'UNION EUROPÉENNE B •</w:t>
       </w:r>
     </w:p>
     <w:p>
@@ -383,7 +383,7 @@
           <w:color w:val="000000"/>
           <w:sz w:val="22"/>
         </w:rPr>
-        <w:t>Il se compose des differents traites. Au titre du droit social quelques textes m'ritent d'etre evoques : La Charte</w:t>
+        <w:t>Il se compose des différents traités. Au titre du droit social quelques textes méritent d'être évoqués : La Charte</w:t>
       </w:r>
     </w:p>
     <w:p>
@@ -393,7 +393,7 @@
           <w:color w:val="000000"/>
           <w:sz w:val="22"/>
         </w:rPr>
-        <w:t>communautaire des droits sociaux fondamentaux des travailleurs de 1989, Le traite de Maastricht de 1992 qui comprend</w:t>
+        <w:t>communautaire des droits sociaux fondamentaux des travailleurs de 1989, Le traité de Maastricht de 1992 qui comprend</w:t>
       </w:r>
     </w:p>
     <w:p>
@@ -403,7 +403,7 @@
           <w:color w:val="000000"/>
           <w:sz w:val="22"/>
         </w:rPr>
-        <w:t>un protocole social, le traite d'Amsterdam de 1997 et plus recemment le traite de Nice, entre en vigueur au 1</w:t>
+        <w:t>un protocole social, le traité d'Amsterdam de 1997 et plus récemment le traité de Nice, entre en vigueur au 1</w:t>
       </w:r>
     </w:p>
     <w:p>
@@ -423,7 +423,7 @@
           <w:color w:val="000000"/>
           <w:sz w:val="22"/>
         </w:rPr>
-        <w:t>fevrier 2003</w:t>
+        <w:t>février 2003</w:t>
       </w:r>
     </w:p>
     <w:p>
@@ -433,7 +433,7 @@
           <w:color w:val="000000"/>
           <w:sz w:val="22"/>
         </w:rPr>
-        <w:t>dont les dispositions sociales sont enoncees aux articles 136 et suivants.</w:t>
+        <w:t>dont les dispositions sociales sont énoncées aux articles 136 et suivants.</w:t>
       </w:r>
     </w:p>
     <w:p>
@@ -446,7 +446,7 @@
           <w:color w:val="2F5496"/>
           <w:sz w:val="24"/>
         </w:rPr>
-        <w:t>LE DROIT D'RIVe</w:t>
+        <w:t>LE DROIT DÉRIVE</w:t>
       </w:r>
     </w:p>
     <w:p>
@@ -479,7 +479,7 @@
           <w:color w:val="000000"/>
           <w:sz w:val="22"/>
         </w:rPr>
-        <w:t>Les reglements. Ce sont des textes directement integres dans le droit interne des etats ;</w:t>
+        <w:t>Les règlements. Ce sont des textes directement intégrés dans le droit interne des états ;</w:t>
       </w:r>
     </w:p>
     <w:p>
@@ -492,7 +492,7 @@
           <w:color w:val="000000"/>
           <w:sz w:val="22"/>
         </w:rPr>
-        <w:t>Les directives. Elles fixent des objectifs obligatoires mais laissent les etats libres quant aux moyens d'y parvenir.</w:t>
+        <w:t>Les directives. Elles fixent des objectifs obligatoires mais laissent les états libres quant aux moyens d'y parvenir.</w:t>
       </w:r>
     </w:p>
     <w:p>
@@ -502,7 +502,7 @@
           <w:color w:val="000000"/>
           <w:sz w:val="22"/>
         </w:rPr>
-        <w:t>Pour exemple la Directive (UE) 2024/2831 relative e l'amelioration des conditions de travail dans le cadre du travail</w:t>
+        <w:t>Pour exemple la Directive (UE) 2024/2831 relative à l'amélioration des conditions de travail dans le cadre du travail</w:t>
       </w:r>
     </w:p>
     <w:p>
@@ -525,7 +525,7 @@
           <w:color w:val="000000"/>
           <w:sz w:val="22"/>
         </w:rPr>
-        <w:t>Les d'cisions. Elles n'ont d'effet qu'e l'egard d'un nombre d'termine de personnes ;</w:t>
+        <w:t>Les décisions. Elles n'ont d'effet qu'à l'égard d'un nombre déterminé de personnes ;</w:t>
       </w:r>
     </w:p>
     <w:p>
@@ -538,7 +538,7 @@
           <w:color w:val="000000"/>
           <w:sz w:val="22"/>
         </w:rPr>
-        <w:t>Les recommandations et avis. Ils n'ont pas de caracteres contraignant e l'egard des etats.</w:t>
+        <w:t>Les recommandations et avis. Ils n'ont pas de caractères contraignant à l'égard des états.</w:t>
       </w:r>
     </w:p>
     <w:p>
@@ -551,7 +551,7 @@
           <w:color w:val="2F5496"/>
           <w:sz w:val="24"/>
         </w:rPr>
-        <w:t>LA JURISPRUDENCE DE L'UNION EUROPeENNE</w:t>
+        <w:t>LA JURISPRUDENCE DE L'UNION EUROPÉENNE</w:t>
       </w:r>
     </w:p>
     <w:p>
@@ -571,7 +571,7 @@
           <w:color w:val="000000"/>
           <w:sz w:val="22"/>
         </w:rPr>
-        <w:t>La Cour de justice de l'Union europeenne et le tribunal de premiere instance de l'Union europeenne sont aussi des</w:t>
+        <w:t>La Cour de justice de l'Union européenne et le tribunal de première instance de l'Union européenne sont aussi des</w:t>
       </w:r>
     </w:p>
     <w:p>
@@ -581,7 +581,7 @@
           <w:color w:val="000000"/>
           <w:sz w:val="22"/>
         </w:rPr>
-        <w:t>sources de premier ordre dans la mesure oe leurs d'cisions invitent e une lecture du droit europeen de nature e avoir une</w:t>
+        <w:t>sources de premier ordre dans la mesure où leurs décisions invitent à une lecture du droit européen de nature à avoir une</w:t>
       </w:r>
     </w:p>
     <w:p>
@@ -591,7 +591,7 @@
           <w:color w:val="000000"/>
           <w:sz w:val="22"/>
         </w:rPr>
-        <w:t>incidence dans le droit interne des etats.</w:t>
+        <w:t>incidence dans le droit interne des états.</w:t>
       </w:r>
     </w:p>
     <w:p>
@@ -601,7 +601,7 @@
           <w:color w:val="000000"/>
           <w:sz w:val="22"/>
         </w:rPr>
-        <w:t>Par exemple, et dernierement, un arret precisant les conditions dans lesquelles le temps d'astreinte peut constituer un</w:t>
+        <w:t>Par exemple, et dernièrement, un arrêt précisant les conditions dans lesquelles le temps d'astreinte peut constituer un</w:t>
       </w:r>
     </w:p>
     <w:p>
@@ -611,7 +611,7 @@
           <w:color w:val="000000"/>
           <w:sz w:val="22"/>
         </w:rPr>
-        <w:t>temps de travail effectif, ou encore les deux arrets de la CJUE en date du 14 mars 2017 relatifs au port visible de tout signe</w:t>
+        <w:t>temps de travail effectif, ou encore les deux arrêts de la CJUE en date du 14 mars 2017 relatifs au port visible de tout signe</w:t>
       </w:r>
     </w:p>
     <w:p>
@@ -635,7 +635,7 @@
           <w:color w:val="2F5496"/>
           <w:sz w:val="24"/>
         </w:rPr>
-        <w:t>LES SOURCES eTATIQUES II e</w:t>
+        <w:t>LES SOURCES ÉTATIQUES II •</w:t>
       </w:r>
     </w:p>
     <w:p>
@@ -648,7 +648,7 @@
           <w:color w:val="2F5496"/>
           <w:sz w:val="24"/>
         </w:rPr>
-        <w:t>LE DOMAINE DE LA LOI A e</w:t>
+        <w:t>LE DOMAINE DE LA LOI A •</w:t>
       </w:r>
     </w:p>
     <w:p>
@@ -661,7 +661,7 @@
           <w:color w:val="2F5496"/>
           <w:sz w:val="24"/>
         </w:rPr>
-        <w:t>LE BLOC DE CONSTITUTINNALITe</w:t>
+        <w:t>LE BLOC DE CONSTITUTINNALITÉ</w:t>
       </w:r>
     </w:p>
     <w:p>
@@ -707,7 +707,7 @@
           <w:color w:val="000000"/>
           <w:sz w:val="22"/>
         </w:rPr>
-        <w:t>le preambule de la constitution du 27 octobre 1946 ;</w:t>
+        <w:t>le préambule de la constitution du 27 octobre 1946 ;</w:t>
       </w:r>
     </w:p>
     <w:p>
@@ -720,7 +720,7 @@
           <w:color w:val="000000"/>
           <w:sz w:val="22"/>
         </w:rPr>
-        <w:t>la d'claration des droits de l'homme et du citoyen de 1789 ;</w:t>
+        <w:t>la déclaration des droits de l'homme et du citoyen de 1789 ;</w:t>
       </w:r>
     </w:p>
     <w:p>
@@ -730,7 +730,7 @@
           <w:color w:val="000000"/>
           <w:sz w:val="22"/>
         </w:rPr>
-        <w:t>la charte de l'environnement promulguee le 1</w:t>
+        <w:t>la charte de l'environnement promulguée le 1</w:t>
       </w:r>
     </w:p>
     <w:p>
@@ -763,7 +763,7 @@
           <w:color w:val="000000"/>
           <w:sz w:val="22"/>
         </w:rPr>
-        <w:t>Chacun de ces textes e valeur constitutionnelle comprend des principes et formule un certain nombre de droits. Par</w:t>
+        <w:t>Chacun de ces textes à valeur constitutionnelle comprend des principes et formule un certain nombre de droits. Par</w:t>
       </w:r>
     </w:p>
     <w:p>
@@ -773,7 +773,7 @@
           <w:color w:val="000000"/>
           <w:sz w:val="22"/>
         </w:rPr>
-        <w:t>exemple le droit au travail, le droit syndical, le droit de greve ou encore le droit e la s'curite sociale, figurent dans le</w:t>
+        <w:t>exemple le droit au travail, le droit syndical, le droit de grave ou encore le droit à la sécurité sociale, figurent dans le</w:t>
       </w:r>
     </w:p>
     <w:p>
@@ -783,7 +783,7 @@
           <w:color w:val="000000"/>
           <w:sz w:val="22"/>
         </w:rPr>
-        <w:t>preambule de 1946. De m'me que le droit de propriet', la liberte d'entreprendre ainsi que la liberte du travail sont</w:t>
+        <w:t>préambule de 1946. De même que le droit de propriété, la liberté d'entreprendre ainsi que la liberté du travail sont</w:t>
       </w:r>
     </w:p>
     <w:p>
@@ -793,7 +793,7 @@
           <w:color w:val="000000"/>
           <w:sz w:val="22"/>
         </w:rPr>
-        <w:t>exprimes dans la d'claration des droits de l'homme.</w:t>
+        <w:t>exprimés dans la déclaration des droits de l'homme.</w:t>
       </w:r>
     </w:p>
     <w:p>
@@ -826,7 +826,7 @@
           <w:color w:val="000000"/>
           <w:sz w:val="22"/>
         </w:rPr>
-        <w:t>L'article 34 de la constitution d'termine le champ d'application de la loi : e La loi est votee par le Parlemente La loi</w:t>
+        <w:t>L'article 34 de la constitution détermine le champ d'application de la loi : à La loi est votée par le Parlemente La loi</w:t>
       </w:r>
     </w:p>
     <w:p>
@@ -836,7 +836,7 @@
           <w:color w:val="000000"/>
           <w:sz w:val="22"/>
         </w:rPr>
-        <w:t>d'termine les principes fondamentaux : edu droit du travail, du droit syndical et de la s'curite sociale. e. Son expression</w:t>
+        <w:t>détermine les principes fondamentaux : cdu droit du travail, du droit syndical et de la sécurité sociale. à. Son expression</w:t>
       </w:r>
     </w:p>
     <w:p>
@@ -846,7 +846,7 @@
           <w:color w:val="000000"/>
           <w:sz w:val="22"/>
         </w:rPr>
-        <w:t>est organisee dans le cadre du code du travail et du code de la s'curite sociale.</w:t>
+        <w:t>est organisée dans le cadre du code du travail et du code de la sécurité sociale.</w:t>
       </w:r>
     </w:p>
     <w:p>
@@ -859,7 +859,7 @@
           <w:color w:val="2F5496"/>
           <w:sz w:val="24"/>
         </w:rPr>
-        <w:t>LE DOMAINE ReGLEMENTAIRE B e</w:t>
+        <w:t>LE DOMAINE RÉGLEMENTAIRE B •</w:t>
       </w:r>
     </w:p>
     <w:p>
@@ -869,7 +869,7 @@
           <w:color w:val="000000"/>
           <w:sz w:val="22"/>
         </w:rPr>
-        <w:t>Au terme de l'article 37 de la constitution de 1958, les domaines qui ne relevent pas de la loi relevent du pouvoir</w:t>
+        <w:t>Au terme de l'article 37 de la constitution de 1958, les domaines qui ne relèvent pas de la loi relèvent du pouvoir</w:t>
       </w:r>
     </w:p>
     <w:p>
@@ -879,7 +879,7 @@
           <w:color w:val="000000"/>
           <w:sz w:val="22"/>
         </w:rPr>
-        <w:t>reglementaire.</w:t>
+        <w:t>réglementaire.</w:t>
       </w:r>
     </w:p>
     <w:p>
@@ -892,7 +892,7 @@
           <w:color w:val="2F5496"/>
           <w:sz w:val="24"/>
         </w:rPr>
-        <w:t>LE POUVOIR ReGLEMENTAIRE</w:t>
+        <w:t>LE POUVOIR RÉGLEMENTAIRE</w:t>
       </w:r>
     </w:p>
     <w:p>
@@ -912,7 +912,7 @@
           <w:color w:val="000000"/>
           <w:sz w:val="22"/>
         </w:rPr>
-        <w:t>L'acte administratif reglementaire (d'cret, arret', etc.) est une regle gen'rale, edictee unilateralement par le pouvoir</w:t>
+        <w:t>L'acte administratif réglementaire (décret, arrête, etc.) est une règle générale, édictée unilatéralement par le pouvoir</w:t>
       </w:r>
     </w:p>
     <w:p>
@@ -922,7 +922,7 @@
           <w:color w:val="000000"/>
           <w:sz w:val="22"/>
         </w:rPr>
-        <w:t>executif. e ce titre le gouvernement dispose non seulement d'un pouvoir reglementaire d'application de la loi mais</w:t>
+        <w:t>exécutif. à ce titre le gouvernement dispose non seulement d'un pouvoir réglementaire d'application de la loi mais</w:t>
       </w:r>
     </w:p>
     <w:p>
@@ -932,7 +932,7 @@
           <w:color w:val="000000"/>
           <w:sz w:val="22"/>
         </w:rPr>
-        <w:t>encore d'un pouvoir reglementaire autonome dans toutes les matieres qui ne sont pas attribuees e la loi par la</w:t>
+        <w:t>encore d'un pouvoir réglementaire autonome dans toutes les matières qui ne sont pas attribuées à la loi par la</w:t>
       </w:r>
     </w:p>
     <w:p>
@@ -985,7 +985,7 @@
           <w:color w:val="C0504D"/>
           <w:sz w:val="22"/>
         </w:rPr>
-        <w:t>relevent eventuellement du domaine de la loi. Par exemple, les ordonnances dites e Macron e du 22 septembre 2017 ou</w:t>
+        <w:t>relèvent éventuellement du domaine de la loi. Par exemple, les ordonnances dites à Macron à du 22 septembre 2017 ou</w:t>
       </w:r>
     </w:p>
     <w:p>
@@ -995,7 +995,7 @@
           <w:color w:val="C0504D"/>
           <w:sz w:val="22"/>
         </w:rPr>
-        <w:t>encore celles des 3, 10 et 17 juin 2020 pour faire face e l'epidemie de COVID.</w:t>
+        <w:t>encore celles des 3, 10 et 17 juin 2020 pour faire face à l'épidémie de COVID.</w:t>
       </w:r>
     </w:p>
     <w:p>
@@ -1008,7 +1008,7 @@
           <w:color w:val="2F5496"/>
           <w:sz w:val="24"/>
         </w:rPr>
-        <w:t>LA JURISPRUDENCE C e</w:t>
+        <w:t>LA JURISPRUDENCE C •</w:t>
       </w:r>
     </w:p>
     <w:p>
@@ -1018,7 +1018,7 @@
           <w:color w:val="000000"/>
           <w:sz w:val="22"/>
         </w:rPr>
-        <w:t>C'est une source particulierement importante etant donne le nombre de litiges portes devant les juridictions sociales.</w:t>
+        <w:t>C'est une source particulièrement importante étant donne le nombre de litiges portes devant les juridictions sociales.</w:t>
       </w:r>
     </w:p>
     <w:p>
@@ -1028,7 +1028,7 @@
           <w:color w:val="000000"/>
           <w:sz w:val="22"/>
         </w:rPr>
-        <w:t>La chambre sociale de la Cour de cassation est ainsi e l'origine d'une importante jurisprudence qui impose une veille</w:t>
+        <w:t>La chambre sociale de la Cour de cassation est ainsi à l'origine d'une importante jurisprudence qui impose une veille</w:t>
       </w:r>
     </w:p>
     <w:p>
@@ -1038,7 +1038,7 @@
           <w:color w:val="000000"/>
           <w:sz w:val="22"/>
         </w:rPr>
-        <w:t>juridique constante. Les d'cisions de la chambre criminelle de la Cour de cassation mais aussi des juridictions adminis-</w:t>
+        <w:t>juridique constante. Les décisions de la chambre criminelle de la Cour de cassation mais aussi des juridictions adminis-</w:t>
       </w:r>
     </w:p>
     <w:p>
@@ -1048,7 +1048,7 @@
           <w:color w:val="000000"/>
           <w:sz w:val="22"/>
         </w:rPr>
-        <w:t>tratives doivent faire l'objet de la m'me attention dans la mesure ou certains litiges du droit social peuvent relever de</w:t>
+        <w:t>tratives doivent faire l'objet de la même attention dans la mesure où certains litiges du droit social peuvent relever de</w:t>
       </w:r>
     </w:p>
     <w:p>
@@ -1058,7 +1058,7 @@
           <w:color w:val="000000"/>
           <w:sz w:val="22"/>
         </w:rPr>
-        <w:t>leur competence (infractions relatives au droit du travail, licenciement des representants du personnele).</w:t>
+        <w:t>leur compétence (infractions relatives au droit du travail, licenciement des représentants du personnelé).</w:t>
       </w:r>
     </w:p>
     <w:p>
@@ -1071,7 +1071,7 @@
           <w:color w:val="2F5496"/>
           <w:sz w:val="24"/>
         </w:rPr>
-        <w:t>LES SOURCES PROFESSIONNELLES III e</w:t>
+        <w:t>LES SOURCES PROFESSIONNELLES III •</w:t>
       </w:r>
     </w:p>
     <w:p>
@@ -1084,7 +1084,7 @@
           <w:color w:val="2F5496"/>
           <w:sz w:val="24"/>
         </w:rPr>
-        <w:t>LES CONVENTIONS ET ACCORDS COLLECTIFS A e</w:t>
+        <w:t>LES CONVENTIONS ET ACCORDS COLLECTIFS A •</w:t>
       </w:r>
     </w:p>
     <w:p>
@@ -1094,7 +1094,7 @@
           <w:color w:val="000000"/>
           <w:sz w:val="22"/>
         </w:rPr>
-        <w:t>Le droit des salaries de participer e la d'termination de leurs conditions de travail est un principe inscrit dans le pream-</w:t>
+        <w:t>Le droit des salariés de participer à la détermination de leurs conditions de travail est un principe inscrit dans le priam-</w:t>
       </w:r>
     </w:p>
     <w:p>
@@ -1104,7 +1104,7 @@
           <w:color w:val="000000"/>
           <w:sz w:val="22"/>
         </w:rPr>
-        <w:t>bule de la constitution de 1946. Ce droit particulierement important s'exerce dans le cadre de la n'gociation collective</w:t>
+        <w:t>bule de la constitution de 1946. Ce droit particulièrement important s'exerce dans le cadre de la négociation collective</w:t>
       </w:r>
     </w:p>
     <w:p>
@@ -1114,7 +1114,7 @@
           <w:color w:val="000000"/>
           <w:sz w:val="22"/>
         </w:rPr>
-        <w:t>aux fins d'aboutir e la conclusion de conventions ou d'accords collectifs.</w:t>
+        <w:t>aux fins d'aboutir à la conclusion de conventions ou d'accords collectifs.</w:t>
       </w:r>
     </w:p>
     <w:p>
@@ -1140,7 +1140,7 @@
           <w:color w:val="000000"/>
           <w:sz w:val="22"/>
         </w:rPr>
-        <w:t>les accords collectifs n'en visent qu'un aspect particulier (formation professionnelle, salairese).</w:t>
+        <w:t>les accords collectifs n'en visent qu'un aspect particulier (formation professionnelle, salairesé).</w:t>
       </w:r>
     </w:p>
     <w:p>
@@ -1150,7 +1150,7 @@
           <w:color w:val="000000"/>
           <w:sz w:val="22"/>
         </w:rPr>
-        <w:t>Tous deux sont n'gocies entre un employeur ou un groupement d'employeurs et une ou plusieurs organisations</w:t>
+        <w:t>Tous deux sont négociés entre un employeur ou un groupement d'employeurs et une ou plusieurs organisations</w:t>
       </w:r>
     </w:p>
     <w:p>
@@ -1160,7 +1160,7 @@
           <w:color w:val="000000"/>
           <w:sz w:val="22"/>
         </w:rPr>
-        <w:t>syndicales representatives de salaries.</w:t>
+        <w:t>syndicales représentatives de salariés.</w:t>
       </w:r>
     </w:p>
     <w:p>
@@ -1170,7 +1170,7 @@
           <w:color w:val="000000"/>
           <w:sz w:val="22"/>
         </w:rPr>
-        <w:t>Ils peuvent etre conclus niveau de la branche (c'est-e-dire dans une branche d'activite, chimie ou m'tallurgie par exem-</w:t>
+        <w:t>Ils peuvent être conclus niveau de la branche (c'est-à-dire dans une branche d'activité, chimie ou métallurgie par exem-</w:t>
       </w:r>
     </w:p>
     <w:p>
@@ -1180,7 +1180,7 @@
           <w:color w:val="000000"/>
           <w:sz w:val="22"/>
         </w:rPr>
-        <w:t>ple), au niveau de l'entreprise (entreprise et etablissement) et au niveau interprofessionnel.</w:t>
+        <w:t>ple), au niveau de l'entreprise (entreprise et établissement) et au niveau interprofessionnel.</w:t>
       </w:r>
     </w:p>
     <w:p>
@@ -1190,7 +1190,7 @@
           <w:color w:val="000000"/>
           <w:sz w:val="22"/>
         </w:rPr>
-        <w:t>En outre, les conventions et accords de branche ou interprofessionnel peuvent etre d'limites geographiquement et etre</w:t>
+        <w:t>En outre, les conventions et accords de branche ou interprofessionnel peuvent être délimités géographiquement et être</w:t>
       </w:r>
     </w:p>
     <w:p>
@@ -1200,7 +1200,7 @@
           <w:color w:val="000000"/>
           <w:sz w:val="22"/>
         </w:rPr>
-        <w:t>conclus au niveau national, regional ou local.</w:t>
+        <w:t>conclus au niveau national, régional ou local.</w:t>
       </w:r>
     </w:p>
     <w:p>
@@ -1213,7 +1213,7 @@
           <w:color w:val="2F5496"/>
           <w:sz w:val="24"/>
         </w:rPr>
-        <w:t>ReGLEMENTS ET ACTES UNILATeRAUX B e</w:t>
+        <w:t>RÈGLEMENTS ET ACTES UNILATÉRAUX B •</w:t>
       </w:r>
     </w:p>
     <w:p>
@@ -1226,7 +1226,7 @@
           <w:color w:val="2F5496"/>
           <w:sz w:val="24"/>
         </w:rPr>
-        <w:t>LE ReGLEMENT INTeRIEUR</w:t>
+        <w:t>LE RÈGLEMENT INTÉRIEUR</w:t>
       </w:r>
     </w:p>
     <w:p>
@@ -1246,7 +1246,7 @@
           <w:color w:val="000000"/>
           <w:sz w:val="22"/>
         </w:rPr>
-        <w:t>L'elaboration d'un reglement interieur constitue une obligation l'gale dans les entreprises employant au moins 20</w:t>
+        <w:t>L'élaboration d'un règlement intérieur constitue une obligation légale dans les entreprises employant au moins 20</w:t>
       </w:r>
     </w:p>
     <w:p>
@@ -1256,7 +1256,7 @@
           <w:color w:val="000000"/>
           <w:sz w:val="22"/>
         </w:rPr>
-        <w:t>salaries. Son contenu est limitatif puisqu'il ne peut contenir que des dispositions relatives e l'hygiene et la s'curite ainsi</w:t>
+        <w:t>salariés. Son contenu est limitatif puisqu'il ne peut contenir que des dispositions relatives à l'hygiène et la sécurité ainsi</w:t>
       </w:r>
     </w:p>
     <w:p>
@@ -1266,7 +1266,7 @@
           <w:color w:val="000000"/>
           <w:sz w:val="22"/>
         </w:rPr>
-        <w:t>qu'e la discipline dans l'entreprise. Il rappelle en outres les dispositions relatives au harcelement. Sa violation peut</w:t>
+        <w:t>qu'à la discipline dans l'entreprise. Il rappelle en outres les dispositions relatives au harcèlement. Sa violation peut</w:t>
       </w:r>
     </w:p>
     <w:p>
@@ -1276,7 +1276,7 @@
           <w:color w:val="000000"/>
           <w:sz w:val="22"/>
         </w:rPr>
-        <w:t>entraener l'application de sanctions disciplinairese;</w:t>
+        <w:t>entraîner l'application de sanctions disciplinairesé;</w:t>
       </w:r>
     </w:p>
     <w:p/>
@@ -1310,7 +1310,7 @@
           <w:color w:val="000000"/>
           <w:sz w:val="22"/>
         </w:rPr>
-        <w:t>Les organisations syndicales patronales peuvent s'adresser directement e leurs adherents sous la forme de</w:t>
+        <w:t>Les organisations syndicales patronales peuvent s'adresser directement à leurs adhérents sous la forme de</w:t>
       </w:r>
     </w:p>
     <w:p>
@@ -1320,7 +1320,7 @@
           <w:color w:val="000000"/>
           <w:sz w:val="22"/>
         </w:rPr>
-        <w:t>recommandations. La Cour de cassation par une d'cision en date 29 juin 1999 leur reconnaet force obligatoire e l'egard</w:t>
+        <w:t>recommandations. La Cour de cassation par une décision en date 29 juin 1999 leur reconnaît force obligatoire à l'égard</w:t>
       </w:r>
     </w:p>
     <w:p>
@@ -1330,7 +1330,7 @@
           <w:color w:val="000000"/>
           <w:sz w:val="22"/>
         </w:rPr>
-        <w:t>de ses adherents d's lors qu'elle revet la forme d'une d'claration claire et precise.</w:t>
+        <w:t>de ses adhérents des lors qu'elle revêt la forme d'une déclaration claire et précise.</w:t>
       </w:r>
     </w:p>
     <w:p>
@@ -1343,7 +1343,7 @@
           <w:color w:val="2F5496"/>
           <w:sz w:val="24"/>
         </w:rPr>
-        <w:t>LES ENGAGEMENTS UNILATeRAUX DE L'EMPLOYEUR</w:t>
+        <w:t>LES ENGAGEMENTS UNILATÉRAUX DE L'EMPLOYEUR</w:t>
       </w:r>
     </w:p>
     <w:p>
@@ -1363,7 +1363,7 @@
           <w:color w:val="000000"/>
           <w:sz w:val="22"/>
         </w:rPr>
-        <w:t>Ce sont les prises d'engagements unilaterales de l'employeur qui peuvent resulter de notes de services, des reponses aux</w:t>
+        <w:t>Ce sont les prises d'engagements unilatérales de l'employeur qui peuvent résulter de notes de services, des réponses aux</w:t>
       </w:r>
     </w:p>
     <w:p>
@@ -1373,7 +1373,7 @@
           <w:color w:val="000000"/>
           <w:sz w:val="22"/>
         </w:rPr>
-        <w:t>representants du personnel ou d'une simple d'claration du chef d'entreprise. La jurisprudence leur confere un caractere</w:t>
+        <w:t>représentants du personnel ou d'une simple déclaration du chef d'entreprise. La jurisprudence leur confère un caractère</w:t>
       </w:r>
     </w:p>
     <w:p>
@@ -1383,7 +1383,7 @@
           <w:color w:val="000000"/>
           <w:sz w:val="22"/>
         </w:rPr>
-        <w:t>obligatoire et leur attribue en tant qu'accords atypiques la procedure de d'nonciation applicable aux usages d's lors</w:t>
+        <w:t>obligatoire et leur attribue en tant qu'accords atypiques la procédure de dénonciation applicable aux usages des lors</w:t>
       </w:r>
     </w:p>
     <w:p>
@@ -1393,7 +1393,7 @@
           <w:color w:val="000000"/>
           <w:sz w:val="22"/>
         </w:rPr>
-        <w:t>qu'il est a dure indeterminee.</w:t>
+        <w:t>qu'il est a dure indéterminée.</w:t>
       </w:r>
     </w:p>
     <w:p>
@@ -1406,7 +1406,7 @@
           <w:color w:val="2F5496"/>
           <w:sz w:val="24"/>
         </w:rPr>
-        <w:t>LES USAGES C e</w:t>
+        <w:t>LES USAGES C •</w:t>
       </w:r>
     </w:p>
     <w:p>
@@ -1429,7 +1429,7 @@
           <w:color w:val="000000"/>
           <w:sz w:val="22"/>
         </w:rPr>
-        <w:t>l'usage professionnel qui s'applique e tout ou partie du personnel dans une profession d'terminee ;</w:t>
+        <w:t>l'usage professionnel qui s'applique à tout ou partie du personnel dans une profession déterminée ;</w:t>
       </w:r>
     </w:p>
     <w:p>
@@ -1452,7 +1452,7 @@
           <w:color w:val="000000"/>
           <w:sz w:val="22"/>
         </w:rPr>
-        <w:t>L'usage a un caractere contraignant pour l'employeur d's lors qu'il peut etre etabli par celui qui l'invoque les caracteres</w:t>
+        <w:t>L'usage a un caractère contraignant pour l'employeur des lors qu'il peut être établi par celui qui l'invoque les caractères</w:t>
       </w:r>
     </w:p>
     <w:p>
@@ -1475,7 +1475,7 @@
           <w:color w:val="000000"/>
           <w:sz w:val="22"/>
         </w:rPr>
-        <w:t>caractere de fixite (l'usage repose sur des modalites d'application identiques) ;</w:t>
+        <w:t>caractère de fixité (l'usage repose sur des modalités d'application identiques) ;</w:t>
       </w:r>
     </w:p>
     <w:p>
@@ -1488,7 +1488,7 @@
           <w:color w:val="000000"/>
           <w:sz w:val="22"/>
         </w:rPr>
-        <w:t>caractere de constance (regularite de l'usage) ;</w:t>
+        <w:t>caractère de constance (régularité de l'usage) ;</w:t>
       </w:r>
     </w:p>
     <w:p>
@@ -1501,7 +1501,7 @@
           <w:color w:val="000000"/>
           <w:sz w:val="22"/>
         </w:rPr>
-        <w:t>caractere de gen'ralite (l'usage ben'ficie e la totalite des salaries ou une partie d'entre eux).</w:t>
+        <w:t>caractère de généralité (l'usage bénéficie à la totalité des salariés ou une partie d'entre eux).</w:t>
       </w:r>
     </w:p>
     <w:p>
@@ -1511,7 +1511,7 @@
           <w:color w:val="000000"/>
           <w:sz w:val="22"/>
         </w:rPr>
-        <w:t>La d'nonciation de l'usage par l'employeur ne peut etre mise en euvre unilateralement sans avoir respecte la</w:t>
+        <w:t>La dénonciation de l'usage par l'employeur ne peut être mise en ouvre unilatéralement sans avoir respecte la</w:t>
       </w:r>
     </w:p>
     <w:p>
@@ -1521,7 +1521,7 @@
           <w:color w:val="000000"/>
           <w:sz w:val="22"/>
         </w:rPr>
-        <w:t>procedure suivante :</w:t>
+        <w:t>procédure suivante :</w:t>
       </w:r>
     </w:p>
     <w:p>
@@ -1534,7 +1534,7 @@
           <w:color w:val="000000"/>
           <w:sz w:val="22"/>
         </w:rPr>
-        <w:t>l'information au prealable les institutions representatives du personnel ;</w:t>
+        <w:t>l'information au préalable les institutions représentatives du personnel ;</w:t>
       </w:r>
     </w:p>
     <w:p>
@@ -1547,7 +1547,7 @@
           <w:color w:val="000000"/>
           <w:sz w:val="22"/>
         </w:rPr>
-        <w:t>l'information au prealable et individuellement de chaque salarie concerne par l'usage ;</w:t>
+        <w:t>l'information au préalable et individuellement de chaque salarié concerne par l'usage ;</w:t>
       </w:r>
     </w:p>
     <w:p>
@@ -1557,9 +1557,10 @@
           <w:color w:val="000000"/>
           <w:sz w:val="22"/>
         </w:rPr>
-        <w:t>l'observation d'un d'lai de prevenance suffisant entre ces informations et la suppression effective de l'usage</w:t>
+        <w:t>l'observation d'un délai de provenance suffisant entre ces informations et la suppression effective de l'usage</w:t>
       </w:r>
     </w:p>
+    <w:p/>
     <w:p/>
     <w:sectPr>
       <w:pgSz w:w="12240" w:h="15840"/>

</xml_diff>

<commit_message>
Reorganise les titres et harmonise le code couleur pedagogique
Co-authored-by: Eva <urdirditfurd@users.noreply.github.com>
</commit_message>
<xml_diff>
--- a/droit social dcg/1- sources du droit social.docx
+++ b/droit social dcg/1- sources du droit social.docx
@@ -27,7 +27,7 @@
           <w:color w:val="2F5496"/>
           <w:sz w:val="24"/>
         </w:rPr>
-        <w:t>LES SOURCES INTERNATIONALES ET COMMUNAUTAIRES I •</w:t>
+        <w:t>I • LES SOURCES INTERNATIONALES ET COMMUNAUTAIRES</w:t>
       </w:r>
     </w:p>
     <w:p>
@@ -40,7 +40,7 @@
           <w:color w:val="2F5496"/>
           <w:sz w:val="24"/>
         </w:rPr>
-        <w:t>LES ACCORDS INTERNATIONAUX A •</w:t>
+        <w:t>A • LES ACCORDS INTERNATIONAUX</w:t>
       </w:r>
     </w:p>
     <w:p>
@@ -100,7 +100,7 @@
       <w:r>
         <w:rPr>
           <w:b w:val="0"/>
-          <w:color w:val="000000"/>
+          <w:color w:val="BF5700"/>
           <w:sz w:val="22"/>
         </w:rPr>
         <w:t>vocation à édicter des normes de nature à améliorer les conditions de travail dans le monde et par là même d'unifier, pas</w:t>
@@ -212,7 +212,7 @@
       <w:r>
         <w:rPr>
           <w:b w:val="0"/>
-          <w:color w:val="000000"/>
+          <w:color w:val="BF5700"/>
           <w:sz w:val="22"/>
         </w:rPr>
         <w:t>Les conventions, qui, une fois ratifiées par les états, créent à leur charge des obligations. Par exemple, la convention</w:t>
@@ -288,7 +288,7 @@
       <w:r>
         <w:rPr>
           <w:b w:val="0"/>
-          <w:color w:val="000000"/>
+          <w:color w:val="00703C"/>
           <w:sz w:val="22"/>
         </w:rPr>
         <w:t>Il s'agit des conventions et autres textes pris dans le cadre du Conseil de l'Europe. Le Conseil de l'Europe est une</w:t>
@@ -350,7 +350,7 @@
           <w:color w:val="2F5496"/>
           <w:sz w:val="24"/>
         </w:rPr>
-        <w:t>LE DROIT DE L'UNION EUROPÉENNE B •</w:t>
+        <w:t>B • LE DROIT DE L'UNION EUROPÉENNE</w:t>
       </w:r>
     </w:p>
     <w:p>
@@ -489,7 +489,7 @@
       <w:r>
         <w:rPr>
           <w:b w:val="0"/>
-          <w:color w:val="000000"/>
+          <w:color w:val="BF5700"/>
           <w:sz w:val="22"/>
         </w:rPr>
         <w:t>Les directives. Elles fixent des objectifs obligatoires mais laissent les états libres quant aux moyens d'y parvenir.</w:t>
@@ -499,7 +499,7 @@
       <w:r>
         <w:rPr>
           <w:b w:val="0"/>
-          <w:color w:val="000000"/>
+          <w:color w:val="BF5700"/>
           <w:sz w:val="22"/>
         </w:rPr>
         <w:t>Pour exemple la Directive (UE) 2024/2831 relative à l'amélioration des conditions de travail dans le cadre du travail</w:t>
@@ -535,7 +535,7 @@
       <w:r>
         <w:rPr>
           <w:b w:val="0"/>
-          <w:color w:val="000000"/>
+          <w:color w:val="00703C"/>
           <w:sz w:val="22"/>
         </w:rPr>
         <w:t>Les recommandations et avis. Ils n'ont pas de caractères contraignant à l'égard des états.</w:t>
@@ -598,7 +598,7 @@
       <w:r>
         <w:rPr>
           <w:b w:val="0"/>
-          <w:color w:val="000000"/>
+          <w:color w:val="BF5700"/>
           <w:sz w:val="22"/>
         </w:rPr>
         <w:t>Par exemple, et dernièrement, un arrêt précisant les conditions dans lesquelles le temps d'astreinte peut constituer un</w:t>
@@ -635,7 +635,7 @@
           <w:color w:val="2F5496"/>
           <w:sz w:val="24"/>
         </w:rPr>
-        <w:t>LES SOURCES ÉTATIQUES II •</w:t>
+        <w:t>II • LES SOURCES ÉTATIQUES</w:t>
       </w:r>
     </w:p>
     <w:p>
@@ -648,7 +648,7 @@
           <w:color w:val="2F5496"/>
           <w:sz w:val="24"/>
         </w:rPr>
-        <w:t>LE DOMAINE DE LA LOI A •</w:t>
+        <w:t>A • LE DOMAINE DE LA LOI</w:t>
       </w:r>
     </w:p>
     <w:p>
@@ -760,7 +760,7 @@
       <w:r>
         <w:rPr>
           <w:b w:val="0"/>
-          <w:color w:val="000000"/>
+          <w:color w:val="BF5700"/>
           <w:sz w:val="22"/>
         </w:rPr>
         <w:t>Chacun de ces textes à valeur constitutionnelle comprend des principes et formule un certain nombre de droits. Par</w:t>
@@ -833,7 +833,7 @@
       <w:r>
         <w:rPr>
           <w:b w:val="0"/>
-          <w:color w:val="000000"/>
+          <w:color w:val="BF5700"/>
           <w:sz w:val="22"/>
         </w:rPr>
         <w:t>détermine les principes fondamentaux : cdu droit du travail, du droit syndical et de la sécurité sociale. à. Son expression</w:t>
@@ -859,7 +859,7 @@
           <w:color w:val="2F5496"/>
           <w:sz w:val="24"/>
         </w:rPr>
-        <w:t>LE DOMAINE RÉGLEMENTAIRE B •</w:t>
+        <w:t>B • LE DOMAINE RÉGLEMENTAIRE</w:t>
       </w:r>
     </w:p>
     <w:p>
@@ -952,7 +952,7 @@
       <w:r>
         <w:rPr>
           <w:b/>
-          <w:color w:val="C0504D"/>
+          <w:color w:val="C00000"/>
           <w:sz w:val="24"/>
         </w:rPr>
         <w:t>EXCEPTION : LES ORDONNANCES</w:t>
@@ -962,7 +962,7 @@
       <w:r>
         <w:rPr>
           <w:b w:val="0"/>
-          <w:color w:val="C0504D"/>
+          <w:color w:val="C00000"/>
           <w:sz w:val="22"/>
         </w:rPr>
         <w:t>?</w:t>
@@ -972,7 +972,7 @@
       <w:r>
         <w:rPr>
           <w:b w:val="0"/>
-          <w:color w:val="C0504D"/>
+          <w:color w:val="C00000"/>
           <w:sz w:val="22"/>
         </w:rPr>
         <w:t>Ce sont des textes pris par le gouvernement sur habilitation du Parlement car les dispositions qui peuvent y figurer</w:t>
@@ -982,7 +982,7 @@
       <w:r>
         <w:rPr>
           <w:b w:val="0"/>
-          <w:color w:val="C0504D"/>
+          <w:color w:val="C00000"/>
           <w:sz w:val="22"/>
         </w:rPr>
         <w:t>relèvent éventuellement du domaine de la loi. Par exemple, les ordonnances dites à Macron à du 22 septembre 2017 ou</w:t>
@@ -992,7 +992,7 @@
       <w:r>
         <w:rPr>
           <w:b w:val="0"/>
-          <w:color w:val="C0504D"/>
+          <w:color w:val="C00000"/>
           <w:sz w:val="22"/>
         </w:rPr>
         <w:t>encore celles des 3, 10 et 17 juin 2020 pour faire face à l'épidémie de COVID.</w:t>
@@ -1008,7 +1008,7 @@
           <w:color w:val="2F5496"/>
           <w:sz w:val="24"/>
         </w:rPr>
-        <w:t>LA JURISPRUDENCE C •</w:t>
+        <w:t>C • LA JURISPRUDENCE</w:t>
       </w:r>
     </w:p>
     <w:p>
@@ -1045,7 +1045,7 @@
       <w:r>
         <w:rPr>
           <w:b w:val="0"/>
-          <w:color w:val="000000"/>
+          <w:color w:val="00703C"/>
           <w:sz w:val="22"/>
         </w:rPr>
         <w:t>tratives doivent faire l'objet de la même attention dans la mesure où certains litiges du droit social peuvent relever de</w:t>
@@ -1071,7 +1071,7 @@
           <w:color w:val="2F5496"/>
           <w:sz w:val="24"/>
         </w:rPr>
-        <w:t>LES SOURCES PROFESSIONNELLES III •</w:t>
+        <w:t>III • LES SOURCES PROFESSIONNELLES</w:t>
       </w:r>
     </w:p>
     <w:p>
@@ -1084,14 +1084,14 @@
           <w:color w:val="2F5496"/>
           <w:sz w:val="24"/>
         </w:rPr>
-        <w:t>LES CONVENTIONS ET ACCORDS COLLECTIFS A •</w:t>
+        <w:t>A • LES CONVENTIONS ET ACCORDS COLLECTIFS</w:t>
       </w:r>
     </w:p>
     <w:p>
       <w:r>
         <w:rPr>
           <w:b w:val="0"/>
-          <w:color w:val="000000"/>
+          <w:color w:val="BF5700"/>
           <w:sz w:val="22"/>
         </w:rPr>
         <w:t>Le droit des salariés de participer à la détermination de leurs conditions de travail est un principe inscrit dans le priam-</w:t>
@@ -1124,7 +1124,7 @@
       <w:r>
         <w:rPr>
           <w:b w:val="0"/>
-          <w:color w:val="000000"/>
+          <w:color w:val="BF5700"/>
           <w:sz w:val="22"/>
         </w:rPr>
         <w:t>les conventions collectives concernent l'ensemble des conditions de travail ;</w:t>
@@ -1213,7 +1213,7 @@
           <w:color w:val="2F5496"/>
           <w:sz w:val="24"/>
         </w:rPr>
-        <w:t>RÈGLEMENTS ET ACTES UNILATÉRAUX B •</w:t>
+        <w:t>B • RÈGLEMENTS ET ACTES UNILATÉRAUX</w:t>
       </w:r>
     </w:p>
     <w:p>
@@ -1243,7 +1243,7 @@
       <w:r>
         <w:rPr>
           <w:b w:val="0"/>
-          <w:color w:val="000000"/>
+          <w:color w:val="BF5700"/>
           <w:sz w:val="22"/>
         </w:rPr>
         <w:t>L'élaboration d'un règlement intérieur constitue une obligation légale dans les entreprises employant au moins 20</w:t>
@@ -1317,7 +1317,7 @@
       <w:r>
         <w:rPr>
           <w:b w:val="0"/>
-          <w:color w:val="000000"/>
+          <w:color w:val="BF5700"/>
           <w:sz w:val="22"/>
         </w:rPr>
         <w:t>recommandations. La Cour de cassation par une décision en date 29 juin 1999 leur reconnaît force obligatoire à l'égard</w:t>
@@ -1370,7 +1370,7 @@
       <w:r>
         <w:rPr>
           <w:b w:val="0"/>
-          <w:color w:val="000000"/>
+          <w:color w:val="00703C"/>
           <w:sz w:val="22"/>
         </w:rPr>
         <w:t>représentants du personnel ou d'une simple déclaration du chef d'entreprise. La jurisprudence leur confère un caractère</w:t>
@@ -1380,7 +1380,7 @@
       <w:r>
         <w:rPr>
           <w:b w:val="0"/>
-          <w:color w:val="000000"/>
+          <w:color w:val="BF5700"/>
           <w:sz w:val="22"/>
         </w:rPr>
         <w:t>obligatoire et leur attribue en tant qu'accords atypiques la procédure de dénonciation applicable aux usages des lors</w:t>
@@ -1406,14 +1406,14 @@
           <w:color w:val="2F5496"/>
           <w:sz w:val="24"/>
         </w:rPr>
-        <w:t>LES USAGES C •</w:t>
+        <w:t>C • LES USAGES</w:t>
       </w:r>
     </w:p>
     <w:p>
       <w:r>
         <w:rPr>
           <w:b w:val="0"/>
-          <w:color w:val="000000"/>
+          <w:color w:val="00703C"/>
           <w:sz w:val="22"/>
         </w:rPr>
         <w:t>On distingue :</w:t>
@@ -1449,7 +1449,7 @@
       <w:r>
         <w:rPr>
           <w:b w:val="0"/>
-          <w:color w:val="000000"/>
+          <w:color w:val="00703C"/>
           <w:sz w:val="22"/>
         </w:rPr>
         <w:t>L'usage a un caractère contraignant pour l'employeur des lors qu'il peut être établi par celui qui l'invoque les caractères</w:t>
@@ -1472,7 +1472,7 @@
       <w:r>
         <w:rPr>
           <w:b w:val="0"/>
-          <w:color w:val="000000"/>
+          <w:color w:val="00703C"/>
           <w:sz w:val="22"/>
         </w:rPr>
         <w:t>caractère de fixité (l'usage repose sur des modalités d'application identiques) ;</w:t>
@@ -1485,7 +1485,7 @@
       <w:r>
         <w:rPr>
           <w:b w:val="0"/>
-          <w:color w:val="000000"/>
+          <w:color w:val="00703C"/>
           <w:sz w:val="22"/>
         </w:rPr>
         <w:t>caractère de constance (régularité de l'usage) ;</w:t>
@@ -1498,7 +1498,7 @@
       <w:r>
         <w:rPr>
           <w:b w:val="0"/>
-          <w:color w:val="000000"/>
+          <w:color w:val="00703C"/>
           <w:sz w:val="22"/>
         </w:rPr>
         <w:t>caractère de généralité (l'usage bénéficie à la totalité des salariés ou une partie d'entre eux).</w:t>
@@ -1518,7 +1518,7 @@
       <w:r>
         <w:rPr>
           <w:b w:val="0"/>
-          <w:color w:val="000000"/>
+          <w:color w:val="BF5700"/>
           <w:sz w:val="22"/>
         </w:rPr>
         <w:t>procédure suivante :</w:t>

</xml_diff>